<commit_message>
edited the word file
</commit_message>
<xml_diff>
--- a/Networking_Last_Project.docx
+++ b/Networking_Last_Project.docx
@@ -2,11 +2,654 @@
 <file path=word/document.xml><?xml version="1.0" encoding="utf-8"?>
 <w:document xmlns:wpc="http://schemas.microsoft.com/office/word/2010/wordprocessingCanvas" xmlns:cx="http://schemas.microsoft.com/office/drawing/2014/chartex" xmlns:cx1="http://schemas.microsoft.com/office/drawing/2015/9/8/chartex" xmlns:cx2="http://schemas.microsoft.com/office/drawing/2015/10/21/chartex" xmlns:cx3="http://schemas.microsoft.com/office/drawing/2016/5/9/chartex" xmlns:cx4="http://schemas.microsoft.com/office/drawing/2016/5/10/chartex" xmlns:cx5="http://schemas.microsoft.com/office/drawing/2016/5/11/chartex" xmlns:cx6="http://schemas.microsoft.com/office/drawing/2016/5/12/chartex" xmlns:cx7="http://schemas.microsoft.com/office/drawing/2016/5/13/chartex" xmlns:cx8="http://schemas.microsoft.com/office/drawing/2016/5/14/chartex" xmlns:mc="http://schemas.openxmlformats.org/markup-compatibility/2006" xmlns:aink="http://schemas.microsoft.com/office/drawing/2016/ink" xmlns:am3d="http://schemas.microsoft.com/office/drawing/2017/model3d" xmlns:o="urn:schemas-microsoft-com:office:office" xmlns:oel="http://schemas.microsoft.com/office/2019/extlst" xmlns:r="http://schemas.openxmlformats.org/officeDocument/2006/relationships" xmlns:m="http://schemas.openxmlformats.org/officeDocument/2006/math" xmlns:v="urn:schemas-microsoft-com:vml" xmlns:wp14="http://schemas.microsoft.com/office/word/2010/wordprocessingDrawing" xmlns:wp="http://schemas.openxmlformats.org/drawingml/2006/wordprocessingDrawing" xmlns:w10="urn:schemas-microsoft-com:office:word" xmlns:w="http://schemas.openxmlformats.org/wordprocessingml/2006/main" xmlns:w14="http://schemas.microsoft.com/office/word/2010/wordml" xmlns:w15="http://schemas.microsoft.com/office/word/2012/wordml" xmlns:w16cex="http://schemas.microsoft.com/office/word/2018/wordml/cex" xmlns:w16cid="http://schemas.microsoft.com/office/word/2016/wordml/cid" xmlns:w16="http://schemas.microsoft.com/office/word/2018/wordml" xmlns:w16du="http://schemas.microsoft.com/office/word/2023/wordml/word16du" xmlns:w16sdtdh="http://schemas.microsoft.com/office/word/2020/wordml/sdtdatahash" xmlns:w16sdtfl="http://schemas.microsoft.com/office/word/2024/wordml/sdtformatlock" xmlns:w16se="http://schemas.microsoft.com/office/word/2015/wordml/symex" xmlns:wpg="http://schemas.microsoft.com/office/word/2010/wordprocessingGroup" xmlns:wpi="http://schemas.microsoft.com/office/word/2010/wordprocessingInk" xmlns:wne="http://schemas.microsoft.com/office/word/2006/wordml" xmlns:wps="http://schemas.microsoft.com/office/word/2010/wordprocessingShape" mc:Ignorable="w14 w15 w16se w16cid w16 w16cex w16sdtdh w16sdtfl w16du wp14">
   <w:body>
+    <w:sdt>
+      <w:sdtPr>
+        <w:id w:val="-106052861"/>
+        <w:docPartObj>
+          <w:docPartGallery w:val="Cover Pages"/>
+          <w:docPartUnique/>
+        </w:docPartObj>
+      </w:sdtPr>
+      <w:sdtContent>
+        <w:p>
+          <w:r>
+            <w:rPr>
+              <w:noProof/>
+            </w:rPr>
+            <mc:AlternateContent>
+              <mc:Choice Requires="wps">
+                <w:drawing>
+                  <wp:anchor distT="0" distB="0" distL="114300" distR="114300" simplePos="0" relativeHeight="251659264" behindDoc="0" locked="0" layoutInCell="1" allowOverlap="1" wp14:anchorId="3FF4DD4F" wp14:editId="2FDAF472">
+                    <wp:simplePos x="0" y="0"/>
+                    <mc:AlternateContent>
+                      <mc:Choice Requires="wp14">
+                        <wp:positionH relativeFrom="page">
+                          <wp14:pctPosHOffset>2000</wp14:pctPosHOffset>
+                        </wp:positionH>
+                      </mc:Choice>
+                      <mc:Fallback>
+                        <wp:positionH relativeFrom="page">
+                          <wp:posOffset>154940</wp:posOffset>
+                        </wp:positionH>
+                      </mc:Fallback>
+                    </mc:AlternateContent>
+                    <mc:AlternateContent>
+                      <mc:Choice Requires="wp14">
+                        <wp:positionV relativeFrom="page">
+                          <wp14:pctPosVOffset>2000</wp14:pctPosVOffset>
+                        </wp:positionV>
+                      </mc:Choice>
+                      <mc:Fallback>
+                        <wp:positionV relativeFrom="page">
+                          <wp:posOffset>200660</wp:posOffset>
+                        </wp:positionV>
+                      </mc:Fallback>
+                    </mc:AlternateContent>
+                    <wp:extent cx="5363210" cy="9653270"/>
+                    <wp:effectExtent l="0" t="0" r="8890" b="2540"/>
+                    <wp:wrapNone/>
+                    <wp:docPr id="471" name="Rectangle 16"/>
+                    <wp:cNvGraphicFramePr>
+                      <a:graphicFrameLocks xmlns:a="http://schemas.openxmlformats.org/drawingml/2006/main"/>
+                    </wp:cNvGraphicFramePr>
+                    <a:graphic xmlns:a="http://schemas.openxmlformats.org/drawingml/2006/main">
+                      <a:graphicData uri="http://schemas.microsoft.com/office/word/2010/wordprocessingShape">
+                        <wps:wsp>
+                          <wps:cNvSpPr>
+                            <a:spLocks/>
+                          </wps:cNvSpPr>
+                          <wps:spPr bwMode="auto">
+                            <a:xfrm>
+                              <a:off x="0" y="0"/>
+                              <a:ext cx="5363210" cy="9653270"/>
+                            </a:xfrm>
+                            <a:prstGeom prst="rect">
+                              <a:avLst/>
+                            </a:prstGeom>
+                            <a:solidFill>
+                              <a:schemeClr val="accent1"/>
+                            </a:solidFill>
+                            <a:ln>
+                              <a:noFill/>
+                            </a:ln>
+                          </wps:spPr>
+                          <wps:txbx>
+                            <w:txbxContent>
+                              <w:sdt>
+                                <w:sdtPr>
+                                  <w:rPr>
+                                    <w:caps/>
+                                    <w:color w:val="FFFFFF" w:themeColor="background1"/>
+                                    <w:sz w:val="80"/>
+                                    <w:szCs w:val="80"/>
+                                  </w:rPr>
+                                  <w:alias w:val="Title"/>
+                                  <w:id w:val="-1275550102"/>
+                                  <w:showingPlcHdr/>
+                                  <w:dataBinding w:prefixMappings="xmlns:ns0='http://schemas.openxmlformats.org/package/2006/metadata/core-properties' xmlns:ns1='http://purl.org/dc/elements/1.1/'" w:xpath="/ns0:coreProperties[1]/ns1:title[1]" w:storeItemID="{6C3C8BC8-F283-45AE-878A-BAB7291924A1}"/>
+                                  <w:text/>
+                                </w:sdtPr>
+                                <w:sdtContent>
+                                  <w:p>
+                                    <w:pPr>
+                                      <w:pStyle w:val="Title"/>
+                                      <w:jc w:val="right"/>
+                                      <w:rPr>
+                                        <w:caps/>
+                                        <w:color w:val="FFFFFF" w:themeColor="background1"/>
+                                        <w:sz w:val="80"/>
+                                        <w:szCs w:val="80"/>
+                                      </w:rPr>
+                                    </w:pPr>
+                                    <w:r>
+                                      <w:rPr>
+                                        <w:caps/>
+                                        <w:color w:val="FFFFFF" w:themeColor="background1"/>
+                                        <w:sz w:val="80"/>
+                                        <w:szCs w:val="80"/>
+                                      </w:rPr>
+                                      <w:t>[Document title]</w:t>
+                                    </w:r>
+                                  </w:p>
+                                </w:sdtContent>
+                              </w:sdt>
+                              <w:p>
+                                <w:pPr>
+                                  <w:spacing w:before="240"/>
+                                  <w:ind w:left="720"/>
+                                  <w:jc w:val="right"/>
+                                  <w:rPr>
+                                    <w:color w:val="FFFFFF" w:themeColor="background1"/>
+                                  </w:rPr>
+                                </w:pPr>
+                              </w:p>
+                              <w:sdt>
+                                <w:sdtPr>
+                                  <w:rPr>
+                                    <w:color w:val="FFFFFF" w:themeColor="background1"/>
+                                    <w:sz w:val="21"/>
+                                    <w:szCs w:val="21"/>
+                                  </w:rPr>
+                                  <w:alias w:val="Abstract"/>
+                                  <w:id w:val="-1812170092"/>
+                                  <w:showingPlcHdr/>
+                                  <w:dataBinding w:prefixMappings="xmlns:ns0='http://schemas.microsoft.com/office/2006/coverPageProps'" w:xpath="/ns0:CoverPageProperties[1]/ns0:Abstract[1]" w:storeItemID="{55AF091B-3C7A-41E3-B477-F2FDAA23CFDA}"/>
+                                  <w:text/>
+                                </w:sdtPr>
+                                <w:sdtContent>
+                                  <w:p>
+                                    <w:pPr>
+                                      <w:spacing w:before="240"/>
+                                      <w:ind w:left="1008"/>
+                                      <w:jc w:val="right"/>
+                                      <w:rPr>
+                                        <w:color w:val="FFFFFF" w:themeColor="background1"/>
+                                      </w:rPr>
+                                    </w:pPr>
+                                    <w:r>
+                                      <w:rPr>
+                                        <w:color w:val="FFFFFF" w:themeColor="background1"/>
+                                        <w:sz w:val="21"/>
+                                        <w:szCs w:val="21"/>
+                                      </w:rPr>
+                                      <w:t>[Draw your reader in with an engaging abstract. It is typically a short summary of the document. When you’re ready to add your content, just click here and start typing.]</w:t>
+                                    </w:r>
+                                  </w:p>
+                                </w:sdtContent>
+                              </w:sdt>
+                            </w:txbxContent>
+                          </wps:txbx>
+                          <wps:bodyPr rot="0" vert="horz" wrap="square" lIns="274320" tIns="914400" rIns="274320" bIns="45720" anchor="ctr" anchorCtr="0" upright="1">
+                            <a:noAutofit/>
+                          </wps:bodyPr>
+                        </wps:wsp>
+                      </a:graphicData>
+                    </a:graphic>
+                    <wp14:sizeRelH relativeFrom="page">
+                      <wp14:pctWidth>69000</wp14:pctWidth>
+                    </wp14:sizeRelH>
+                    <wp14:sizeRelV relativeFrom="page">
+                      <wp14:pctHeight>96000</wp14:pctHeight>
+                    </wp14:sizeRelV>
+                  </wp:anchor>
+                </w:drawing>
+              </mc:Choice>
+              <mc:Fallback>
+                <w:pict>
+                  <v:rect w14:anchorId="3FF4DD4F" id="Rectangle 16" o:spid="_x0000_s1026" style="position:absolute;margin-left:0;margin-top:0;width:422.3pt;height:760.1pt;z-index:251659264;visibility:visible;mso-wrap-style:square;mso-width-percent:690;mso-height-percent:960;mso-left-percent:20;mso-top-percent:20;mso-wrap-distance-left:9pt;mso-wrap-distance-top:0;mso-wrap-distance-right:9pt;mso-wrap-distance-bottom:0;mso-position-horizontal-relative:page;mso-position-vertical-relative:page;mso-width-percent:690;mso-height-percent:960;mso-left-percent:20;mso-top-percent:20;mso-width-relative:page;mso-height-relative:page;v-text-anchor:middle" o:gfxdata="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" fillcolor="#156082 [3204]" stroked="f">
+                    <v:textbox inset="21.6pt,1in,21.6pt">
+                      <w:txbxContent>
+                        <w:sdt>
+                          <w:sdtPr>
+                            <w:rPr>
+                              <w:caps/>
+                              <w:color w:val="FFFFFF" w:themeColor="background1"/>
+                              <w:sz w:val="80"/>
+                              <w:szCs w:val="80"/>
+                            </w:rPr>
+                            <w:alias w:val="Title"/>
+                            <w:id w:val="-1275550102"/>
+                            <w:showingPlcHdr/>
+                            <w:dataBinding w:prefixMappings="xmlns:ns0='http://schemas.openxmlformats.org/package/2006/metadata/core-properties' xmlns:ns1='http://purl.org/dc/elements/1.1/'" w:xpath="/ns0:coreProperties[1]/ns1:title[1]" w:storeItemID="{6C3C8BC8-F283-45AE-878A-BAB7291924A1}"/>
+                            <w:text/>
+                          </w:sdtPr>
+                          <w:sdtContent>
+                            <w:p>
+                              <w:pPr>
+                                <w:pStyle w:val="Title"/>
+                                <w:jc w:val="right"/>
+                                <w:rPr>
+                                  <w:caps/>
+                                  <w:color w:val="FFFFFF" w:themeColor="background1"/>
+                                  <w:sz w:val="80"/>
+                                  <w:szCs w:val="80"/>
+                                </w:rPr>
+                              </w:pPr>
+                              <w:r>
+                                <w:rPr>
+                                  <w:caps/>
+                                  <w:color w:val="FFFFFF" w:themeColor="background1"/>
+                                  <w:sz w:val="80"/>
+                                  <w:szCs w:val="80"/>
+                                </w:rPr>
+                                <w:t>[Document title]</w:t>
+                              </w:r>
+                            </w:p>
+                          </w:sdtContent>
+                        </w:sdt>
+                        <w:p>
+                          <w:pPr>
+                            <w:spacing w:before="240"/>
+                            <w:ind w:left="720"/>
+                            <w:jc w:val="right"/>
+                            <w:rPr>
+                              <w:color w:val="FFFFFF" w:themeColor="background1"/>
+                            </w:rPr>
+                          </w:pPr>
+                        </w:p>
+                        <w:sdt>
+                          <w:sdtPr>
+                            <w:rPr>
+                              <w:color w:val="FFFFFF" w:themeColor="background1"/>
+                              <w:sz w:val="21"/>
+                              <w:szCs w:val="21"/>
+                            </w:rPr>
+                            <w:alias w:val="Abstract"/>
+                            <w:id w:val="-1812170092"/>
+                            <w:showingPlcHdr/>
+                            <w:dataBinding w:prefixMappings="xmlns:ns0='http://schemas.microsoft.com/office/2006/coverPageProps'" w:xpath="/ns0:CoverPageProperties[1]/ns0:Abstract[1]" w:storeItemID="{55AF091B-3C7A-41E3-B477-F2FDAA23CFDA}"/>
+                            <w:text/>
+                          </w:sdtPr>
+                          <w:sdtContent>
+                            <w:p>
+                              <w:pPr>
+                                <w:spacing w:before="240"/>
+                                <w:ind w:left="1008"/>
+                                <w:jc w:val="right"/>
+                                <w:rPr>
+                                  <w:color w:val="FFFFFF" w:themeColor="background1"/>
+                                </w:rPr>
+                              </w:pPr>
+                              <w:r>
+                                <w:rPr>
+                                  <w:color w:val="FFFFFF" w:themeColor="background1"/>
+                                  <w:sz w:val="21"/>
+                                  <w:szCs w:val="21"/>
+                                </w:rPr>
+                                <w:t>[Draw your reader in with an engaging abstract. It is typically a short summary of the document. When you’re ready to add your content, just click here and start typing.]</w:t>
+                              </w:r>
+                            </w:p>
+                          </w:sdtContent>
+                        </w:sdt>
+                      </w:txbxContent>
+                    </v:textbox>
+                    <w10:wrap anchorx="page" anchory="page"/>
+                  </v:rect>
+                </w:pict>
+              </mc:Fallback>
+            </mc:AlternateContent>
+          </w:r>
+          <w:r>
+            <w:rPr>
+              <w:noProof/>
+            </w:rPr>
+            <mc:AlternateContent>
+              <mc:Choice Requires="wps">
+                <w:drawing>
+                  <wp:anchor distT="0" distB="0" distL="114300" distR="114300" simplePos="0" relativeHeight="251660288" behindDoc="0" locked="0" layoutInCell="1" allowOverlap="1" wp14:anchorId="7DE07D98" wp14:editId="283F3BA9">
+                    <wp:simplePos x="0" y="0"/>
+                    <mc:AlternateContent>
+                      <mc:Choice Requires="wp14">
+                        <wp:positionH relativeFrom="page">
+                          <wp14:pctPosHOffset>73000</wp14:pctPosHOffset>
+                        </wp:positionH>
+                      </mc:Choice>
+                      <mc:Fallback>
+                        <wp:positionH relativeFrom="page">
+                          <wp:posOffset>5673725</wp:posOffset>
+                        </wp:positionH>
+                      </mc:Fallback>
+                    </mc:AlternateContent>
+                    <wp:positionV relativeFrom="page">
+                      <wp:align>center</wp:align>
+                    </wp:positionV>
+                    <wp:extent cx="1880870" cy="9655810"/>
+                    <wp:effectExtent l="0" t="0" r="5080" b="2540"/>
+                    <wp:wrapNone/>
+                    <wp:docPr id="472" name="Rectangle 268"/>
+                    <wp:cNvGraphicFramePr>
+                      <a:graphicFrameLocks xmlns:a="http://schemas.openxmlformats.org/drawingml/2006/main"/>
+                    </wp:cNvGraphicFramePr>
+                    <a:graphic xmlns:a="http://schemas.openxmlformats.org/drawingml/2006/main">
+                      <a:graphicData uri="http://schemas.microsoft.com/office/word/2010/wordprocessingShape">
+                        <wps:wsp>
+                          <wps:cNvSpPr>
+                            <a:spLocks/>
+                          </wps:cNvSpPr>
+                          <wps:spPr>
+                            <a:xfrm>
+                              <a:off x="0" y="0"/>
+                              <a:ext cx="1880870" cy="9655810"/>
+                            </a:xfrm>
+                            <a:prstGeom prst="rect">
+                              <a:avLst/>
+                            </a:prstGeom>
+                            <a:solidFill>
+                              <a:schemeClr val="tx2"/>
+                            </a:solidFill>
+                            <a:ln>
+                              <a:noFill/>
+                            </a:ln>
+                          </wps:spPr>
+                          <wps:style>
+                            <a:lnRef idx="2">
+                              <a:schemeClr val="accent1">
+                                <a:shade val="50000"/>
+                              </a:schemeClr>
+                            </a:lnRef>
+                            <a:fillRef idx="1">
+                              <a:schemeClr val="accent1"/>
+                            </a:fillRef>
+                            <a:effectRef idx="0">
+                              <a:schemeClr val="accent1"/>
+                            </a:effectRef>
+                            <a:fontRef idx="minor">
+                              <a:schemeClr val="lt1"/>
+                            </a:fontRef>
+                          </wps:style>
+                          <wps:txbx>
+                            <w:txbxContent>
+                              <w:sdt>
+                                <w:sdtPr>
+                                  <w:rPr>
+                                    <w:rFonts w:cstheme="minorBidi"/>
+                                    <w:color w:val="FFFFFF" w:themeColor="background1"/>
+                                  </w:rPr>
+                                  <w:alias w:val="Subtitle"/>
+                                  <w:id w:val="-505288762"/>
+                                  <w:showingPlcHdr/>
+                                  <w:dataBinding w:prefixMappings="xmlns:ns0='http://schemas.openxmlformats.org/package/2006/metadata/core-properties' xmlns:ns1='http://purl.org/dc/elements/1.1/'" w:xpath="/ns0:coreProperties[1]/ns1:subject[1]" w:storeItemID="{6C3C8BC8-F283-45AE-878A-BAB7291924A1}"/>
+                                  <w:text/>
+                                </w:sdtPr>
+                                <w:sdtContent>
+                                  <w:p>
+                                    <w:pPr>
+                                      <w:pStyle w:val="Subtitle"/>
+                                      <w:rPr>
+                                        <w:rFonts w:cstheme="minorBidi"/>
+                                        <w:color w:val="FFFFFF" w:themeColor="background1"/>
+                                      </w:rPr>
+                                    </w:pPr>
+                                    <w:r>
+                                      <w:rPr>
+                                        <w:rFonts w:eastAsiaTheme="minorEastAsia" w:cstheme="minorBidi"/>
+                                        <w:color w:val="FFFFFF" w:themeColor="background1"/>
+                                      </w:rPr>
+                                      <w:t>[Document subtitle]</w:t>
+                                    </w:r>
+                                  </w:p>
+                                </w:sdtContent>
+                              </w:sdt>
+                            </w:txbxContent>
+                          </wps:txbx>
+                          <wps:bodyPr rot="0" spcFirstLastPara="0" vertOverflow="overflow" horzOverflow="overflow" vert="horz" wrap="square" lIns="182880" tIns="45720" rIns="182880" bIns="45720" numCol="1" spcCol="0" rtlCol="0" fromWordArt="0" anchor="ctr" anchorCtr="0" forceAA="0" compatLnSpc="1">
+                            <a:prstTxWarp prst="textNoShape">
+                              <a:avLst/>
+                            </a:prstTxWarp>
+                            <a:noAutofit/>
+                          </wps:bodyPr>
+                        </wps:wsp>
+                      </a:graphicData>
+                    </a:graphic>
+                    <wp14:sizeRelH relativeFrom="page">
+                      <wp14:pctWidth>24200</wp14:pctWidth>
+                    </wp14:sizeRelH>
+                    <wp14:sizeRelV relativeFrom="page">
+                      <wp14:pctHeight>96000</wp14:pctHeight>
+                    </wp14:sizeRelV>
+                  </wp:anchor>
+                </w:drawing>
+              </mc:Choice>
+              <mc:Fallback>
+                <w:pict>
+                  <v:rect w14:anchorId="7DE07D98" id="Rectangle 268" o:spid="_x0000_s1027" style="position:absolute;margin-left:0;margin-top:0;width:148.1pt;height:760.3pt;z-index:251660288;visibility:visible;mso-wrap-style:square;mso-width-percent:242;mso-height-percent:960;mso-left-percent:730;mso-wrap-distance-left:9pt;mso-wrap-distance-top:0;mso-wrap-distance-right:9pt;mso-wrap-distance-bottom:0;mso-position-horizontal-relative:page;mso-position-vertical:center;mso-position-vertical-relative:page;mso-width-percent:242;mso-height-percent:960;mso-left-percent:730;mso-width-relative:page;mso-height-relative:page;v-text-anchor:middle" o:gfxdata="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" fillcolor="#0e2841 [3215]" stroked="f" strokeweight="1.5pt">
+                    <v:textbox inset="14.4pt,,14.4pt">
+                      <w:txbxContent>
+                        <w:sdt>
+                          <w:sdtPr>
+                            <w:rPr>
+                              <w:rFonts w:cstheme="minorBidi"/>
+                              <w:color w:val="FFFFFF" w:themeColor="background1"/>
+                            </w:rPr>
+                            <w:alias w:val="Subtitle"/>
+                            <w:id w:val="-505288762"/>
+                            <w:showingPlcHdr/>
+                            <w:dataBinding w:prefixMappings="xmlns:ns0='http://schemas.openxmlformats.org/package/2006/metadata/core-properties' xmlns:ns1='http://purl.org/dc/elements/1.1/'" w:xpath="/ns0:coreProperties[1]/ns1:subject[1]" w:storeItemID="{6C3C8BC8-F283-45AE-878A-BAB7291924A1}"/>
+                            <w:text/>
+                          </w:sdtPr>
+                          <w:sdtContent>
+                            <w:p>
+                              <w:pPr>
+                                <w:pStyle w:val="Subtitle"/>
+                                <w:rPr>
+                                  <w:rFonts w:cstheme="minorBidi"/>
+                                  <w:color w:val="FFFFFF" w:themeColor="background1"/>
+                                </w:rPr>
+                              </w:pPr>
+                              <w:r>
+                                <w:rPr>
+                                  <w:rFonts w:eastAsiaTheme="minorEastAsia" w:cstheme="minorBidi"/>
+                                  <w:color w:val="FFFFFF" w:themeColor="background1"/>
+                                </w:rPr>
+                                <w:t>[Document subtitle]</w:t>
+                              </w:r>
+                            </w:p>
+                          </w:sdtContent>
+                        </w:sdt>
+                      </w:txbxContent>
+                    </v:textbox>
+                    <w10:wrap anchorx="page" anchory="page"/>
+                  </v:rect>
+                </w:pict>
+              </mc:Fallback>
+            </mc:AlternateContent>
+          </w:r>
+        </w:p>
+        <w:p/>
+        <w:p>
+          <w:r>
+            <w:br w:type="page"/>
+          </w:r>
+        </w:p>
+      </w:sdtContent>
+    </w:sdt>
+    <w:p>
+      <w:r>
+        <w:lastRenderedPageBreak/>
+        <w:br w:type="page"/>
+      </w:r>
+    </w:p>
+    <w:sdt>
+      <w:sdtPr>
+        <w:id w:val="-1906135537"/>
+        <w:docPartObj>
+          <w:docPartGallery w:val="Table of Contents"/>
+          <w:docPartUnique/>
+        </w:docPartObj>
+      </w:sdtPr>
+      <w:sdtEndPr>
+        <w:rPr>
+          <w:rFonts w:asciiTheme="minorHAnsi" w:eastAsiaTheme="minorHAnsi" w:hAnsiTheme="minorHAnsi" w:cstheme="minorBidi"/>
+          <w:b/>
+          <w:bCs/>
+          <w:noProof/>
+          <w:color w:val="auto"/>
+          <w:kern w:val="2"/>
+          <w:sz w:val="24"/>
+          <w:szCs w:val="24"/>
+          <w:lang w:val="en-CA"/>
+          <w14:ligatures w14:val="standardContextual"/>
+        </w:rPr>
+      </w:sdtEndPr>
+      <w:sdtContent>
+        <w:p>
+          <w:pPr>
+            <w:pStyle w:val="TOCHeading"/>
+            <w:jc w:val="center"/>
+          </w:pPr>
+          <w:r>
+            <w:t>Table of Contents</w:t>
+          </w:r>
+        </w:p>
+        <w:p>
+          <w:pPr>
+            <w:pStyle w:val="TOC1"/>
+            <w:tabs>
+              <w:tab w:val="right" w:leader="dot" w:pos="9350"/>
+            </w:tabs>
+            <w:rPr>
+              <w:noProof/>
+            </w:rPr>
+          </w:pPr>
+          <w:r>
+            <w:fldChar w:fldCharType="begin"/>
+          </w:r>
+          <w:r>
+            <w:instrText xml:space="preserve"> TOC \o "1-3" \h \z \u </w:instrText>
+          </w:r>
+          <w:r>
+            <w:fldChar w:fldCharType="separate"/>
+          </w:r>
+          <w:hyperlink w:anchor="_Toc228437465" w:history="1">
+            <w:r>
+              <w:rPr>
+                <w:rStyle w:val="Hyperlink"/>
+                <w:rFonts w:ascii="Amasis MT Pro Medium" w:hAnsi="Amasis MT Pro Medium"/>
+                <w:noProof/>
+              </w:rPr>
+              <w:t>Appendices</w:t>
+            </w:r>
+            <w:r>
+              <w:rPr>
+                <w:noProof/>
+                <w:webHidden/>
+              </w:rPr>
+              <w:tab/>
+            </w:r>
+            <w:r>
+              <w:rPr>
+                <w:noProof/>
+                <w:webHidden/>
+              </w:rPr>
+              <w:fldChar w:fldCharType="begin"/>
+            </w:r>
+            <w:r>
+              <w:rPr>
+                <w:noProof/>
+                <w:webHidden/>
+              </w:rPr>
+              <w:instrText xml:space="preserve"> PAGEREF _Toc228437465 \h </w:instrText>
+            </w:r>
+            <w:r>
+              <w:rPr>
+                <w:noProof/>
+                <w:webHidden/>
+              </w:rPr>
+            </w:r>
+            <w:r>
+              <w:rPr>
+                <w:noProof/>
+                <w:webHidden/>
+              </w:rPr>
+              <w:fldChar w:fldCharType="separate"/>
+            </w:r>
+            <w:r>
+              <w:rPr>
+                <w:noProof/>
+                <w:webHidden/>
+              </w:rPr>
+              <w:t>2</w:t>
+            </w:r>
+            <w:r>
+              <w:rPr>
+                <w:noProof/>
+                <w:webHidden/>
+              </w:rPr>
+              <w:fldChar w:fldCharType="end"/>
+            </w:r>
+          </w:hyperlink>
+        </w:p>
+        <w:p>
+          <w:r>
+            <w:rPr>
+              <w:b/>
+              <w:bCs/>
+              <w:noProof/>
+            </w:rPr>
+            <w:fldChar w:fldCharType="end"/>
+          </w:r>
+        </w:p>
+      </w:sdtContent>
+    </w:sdt>
+    <w:p>
+      <w:r>
+        <w:br w:type="page"/>
+      </w:r>
+    </w:p>
+    <w:p>
+      <w:r>
+        <w:lastRenderedPageBreak/>
+        <w:br w:type="page"/>
+      </w:r>
+    </w:p>
     <w:p/>
+    <w:p>
+      <w:pPr>
+        <w:pStyle w:val="Heading1"/>
+        <w:jc w:val="center"/>
+        <w:rPr>
+          <w:rFonts w:ascii="Amasis MT Pro Medium" w:hAnsi="Amasis MT Pro Medium"/>
+        </w:rPr>
+      </w:pPr>
+      <w:bookmarkStart w:id="0" w:name="_Toc228437465"/>
+      <w:r>
+        <w:rPr>
+          <w:rFonts w:ascii="Amasis MT Pro Medium" w:hAnsi="Amasis MT Pro Medium"/>
+        </w:rPr>
+        <w:t>Appendi</w:t>
+      </w:r>
+      <w:r>
+        <w:rPr>
+          <w:rFonts w:ascii="Amasis MT Pro Medium" w:hAnsi="Amasis MT Pro Medium"/>
+        </w:rPr>
+        <w:t>ces</w:t>
+      </w:r>
+      <w:bookmarkEnd w:id="0"/>
+    </w:p>
+    <w:p>
+      <w:r>
+        <w:rPr>
+          <w:b/>
+          <w:bCs/>
+        </w:rPr>
+        <w:t>Appendix A:</w:t>
+      </w:r>
+      <w:r>
+        <w:t xml:space="preserve"> Terms and Definitions:</w:t>
+      </w:r>
+    </w:p>
+    <w:p/>
+    <w:p>
+      <w:r>
+        <w:rPr>
+          <w:b/>
+          <w:bCs/>
+        </w:rPr>
+        <w:t>Appendix B:</w:t>
+      </w:r>
+      <w:r>
+        <w:t xml:space="preserve"> Network Diagrams:</w:t>
+      </w:r>
+    </w:p>
+    <w:p/>
+    <w:p>
+      <w:r>
+        <w:rPr>
+          <w:b/>
+          <w:bCs/>
+        </w:rPr>
+        <w:t>Appendix C:</w:t>
+      </w:r>
+      <w:r>
+        <w:t xml:space="preserve"> Inventory List:</w:t>
+      </w:r>
+    </w:p>
     <w:sectPr>
       <w:pgSz w:w="12240" w:h="15840"/>
       <w:pgMar w:top="1440" w:right="1440" w:bottom="1440" w:left="1440" w:header="708" w:footer="708" w:gutter="0"/>
+      <w:pgNumType w:start="0"/>
       <w:cols w:space="708"/>
+      <w:titlePg/>
       <w:docGrid w:linePitch="360"/>
     </w:sectPr>
   </w:body>
@@ -930,6 +1573,49 @@
       <w:spacing w:val="5"/>
     </w:rPr>
   </w:style>
+  <w:style w:type="paragraph" w:styleId="TOCHeading">
+    <w:name w:val="TOC Heading"/>
+    <w:basedOn w:val="Heading1"/>
+    <w:next w:val="Normal"/>
+    <w:uiPriority w:val="39"/>
+    <w:unhideWhenUsed/>
+    <w:qFormat/>
+    <w:rsid w:val="00BC6B62"/>
+    <w:pPr>
+      <w:spacing w:before="240" w:after="0" w:line="259" w:lineRule="auto"/>
+      <w:outlineLvl w:val="9"/>
+    </w:pPr>
+    <w:rPr>
+      <w:kern w:val="0"/>
+      <w:sz w:val="32"/>
+      <w:szCs w:val="32"/>
+      <w:lang w:val="en-US"/>
+      <w14:ligatures w14:val="none"/>
+    </w:rPr>
+  </w:style>
+  <w:style w:type="paragraph" w:styleId="TOC1">
+    <w:name w:val="toc 1"/>
+    <w:basedOn w:val="Normal"/>
+    <w:next w:val="Normal"/>
+    <w:autoRedefine/>
+    <w:uiPriority w:val="39"/>
+    <w:unhideWhenUsed/>
+    <w:rsid w:val="00BC6B62"/>
+    <w:pPr>
+      <w:spacing w:after="100"/>
+    </w:pPr>
+  </w:style>
+  <w:style w:type="character" w:styleId="Hyperlink">
+    <w:name w:val="Hyperlink"/>
+    <w:basedOn w:val="DefaultParagraphFont"/>
+    <w:uiPriority w:val="99"/>
+    <w:unhideWhenUsed/>
+    <w:rsid w:val="00BC6B62"/>
+    <w:rPr>
+      <w:color w:val="467886" w:themeColor="hyperlink"/>
+      <w:u w:val="single"/>
+    </w:rPr>
+  </w:style>
 </w:styles>
 </file>
 
@@ -1246,4 +1932,16 @@
     </a:ext>
   </a:extLst>
 </a:theme>
+</file>
+
+<file path=customXml/item1.xml><?xml version="1.0" encoding="utf-8"?>
+<b:Sources xmlns:b="http://schemas.openxmlformats.org/officeDocument/2006/bibliography" xmlns="http://schemas.openxmlformats.org/officeDocument/2006/bibliography" SelectedStyle="\APASixthEditionOfficeOnline.xsl" StyleName="APA" Version="6"/>
+</file>
+
+<file path=customXml/itemProps1.xml><?xml version="1.0" encoding="utf-8"?>
+<ds:datastoreItem xmlns:ds="http://schemas.openxmlformats.org/officeDocument/2006/customXml" ds:itemID="{1F855CB0-14FB-4B70-BF19-4E3352481A5D}">
+  <ds:schemaRefs>
+    <ds:schemaRef ds:uri="http://schemas.openxmlformats.org/officeDocument/2006/bibliography"/>
+  </ds:schemaRefs>
+</ds:datastoreItem>
 </file>
</xml_diff>

<commit_message>
Started formatting the report
</commit_message>
<xml_diff>
--- a/Networking_Last_Project.docx
+++ b/Networking_Last_Project.docx
@@ -1,16 +1,27 @@
 
 <file path=word/document.xml><?xml version="1.0" encoding="utf-8"?>
 <w:document xmlns:wpc="http://schemas.microsoft.com/office/word/2010/wordprocessingCanvas" xmlns:cx="http://schemas.microsoft.com/office/drawing/2014/chartex" xmlns:cx1="http://schemas.microsoft.com/office/drawing/2015/9/8/chartex" xmlns:cx2="http://schemas.microsoft.com/office/drawing/2015/10/21/chartex" xmlns:cx3="http://schemas.microsoft.com/office/drawing/2016/5/9/chartex" xmlns:cx4="http://schemas.microsoft.com/office/drawing/2016/5/10/chartex" xmlns:cx5="http://schemas.microsoft.com/office/drawing/2016/5/11/chartex" xmlns:cx6="http://schemas.microsoft.com/office/drawing/2016/5/12/chartex" xmlns:cx7="http://schemas.microsoft.com/office/drawing/2016/5/13/chartex" xmlns:cx8="http://schemas.microsoft.com/office/drawing/2016/5/14/chartex" xmlns:mc="http://schemas.openxmlformats.org/markup-compatibility/2006" xmlns:aink="http://schemas.microsoft.com/office/drawing/2016/ink" xmlns:am3d="http://schemas.microsoft.com/office/drawing/2017/model3d" xmlns:o="urn:schemas-microsoft-com:office:office" xmlns:oel="http://schemas.microsoft.com/office/2019/extlst" xmlns:r="http://schemas.openxmlformats.org/officeDocument/2006/relationships" xmlns:m="http://schemas.openxmlformats.org/officeDocument/2006/math" xmlns:v="urn:schemas-microsoft-com:vml" xmlns:wp14="http://schemas.microsoft.com/office/word/2010/wordprocessingDrawing" xmlns:wp="http://schemas.openxmlformats.org/drawingml/2006/wordprocessingDrawing" xmlns:w10="urn:schemas-microsoft-com:office:word" xmlns:w="http://schemas.openxmlformats.org/wordprocessingml/2006/main" xmlns:w14="http://schemas.microsoft.com/office/word/2010/wordml" xmlns:w15="http://schemas.microsoft.com/office/word/2012/wordml" xmlns:w16cex="http://schemas.microsoft.com/office/word/2018/wordml/cex" xmlns:w16cid="http://schemas.microsoft.com/office/word/2016/wordml/cid" xmlns:w16="http://schemas.microsoft.com/office/word/2018/wordml" xmlns:w16du="http://schemas.microsoft.com/office/word/2023/wordml/word16du" xmlns:w16sdtdh="http://schemas.microsoft.com/office/word/2020/wordml/sdtdatahash" xmlns:w16sdtfl="http://schemas.microsoft.com/office/word/2024/wordml/sdtformatlock" xmlns:w16se="http://schemas.microsoft.com/office/word/2015/wordml/symex" xmlns:wpg="http://schemas.microsoft.com/office/word/2010/wordprocessingGroup" xmlns:wpi="http://schemas.microsoft.com/office/word/2010/wordprocessingInk" xmlns:wne="http://schemas.microsoft.com/office/word/2006/wordml" xmlns:wps="http://schemas.microsoft.com/office/word/2010/wordprocessingShape" mc:Ignorable="w14 w15 w16se w16cid w16 w16cex w16sdtdh w16sdtfl w16du wp14">
-  <w:background w:color="E8E8E8" w:themeColor="background2"/>
+  <w:background w:color="DCEAF7" w:themeColor="text2" w:themeTint="19"/>
   <w:body>
     <w:sdt>
       <w:sdtPr>
-        <w:id w:val="-106052861"/>
+        <w:id w:val="-1027564377"/>
         <w:docPartObj>
           <w:docPartGallery w:val="Cover Pages"/>
           <w:docPartUnique/>
         </w:docPartObj>
       </w:sdtPr>
+      <w:sdtEndPr>
+        <w:rPr>
+          <w:rFonts w:asciiTheme="majorHAnsi" w:eastAsiaTheme="majorEastAsia" w:hAnsiTheme="majorHAnsi" w:cstheme="majorBidi"/>
+          <w:caps/>
+          <w:color w:val="FFFFFF" w:themeColor="background1"/>
+          <w:spacing w:val="-10"/>
+          <w:kern w:val="28"/>
+          <w:sz w:val="80"/>
+          <w:szCs w:val="80"/>
+        </w:rPr>
+      </w:sdtEndPr>
       <w:sdtContent>
         <w:p>
           <w:r>
@@ -18,364 +29,569 @@
               <w:noProof/>
             </w:rPr>
             <mc:AlternateContent>
-              <mc:Choice Requires="wps">
+              <mc:Choice Requires="wpg">
                 <w:drawing>
-                  <wp:anchor distT="0" distB="0" distL="114300" distR="114300" simplePos="0" relativeHeight="251659264" behindDoc="0" locked="0" layoutInCell="1" allowOverlap="1" wp14:anchorId="3FF4DD4F" wp14:editId="2E6FE29C">
+                  <wp:anchor distT="0" distB="0" distL="114300" distR="114300" simplePos="0" relativeHeight="251664384" behindDoc="1" locked="0" layoutInCell="1" allowOverlap="1" wp14:anchorId="291A24B8" wp14:editId="441DE8E9">
                     <wp:simplePos x="0" y="0"/>
-                    <mc:AlternateContent>
-                      <mc:Choice Requires="wp14">
-                        <wp:positionH relativeFrom="page">
-                          <wp14:pctPosHOffset>2000</wp14:pctPosHOffset>
-                        </wp:positionH>
-                      </mc:Choice>
-                      <mc:Fallback>
-                        <wp:positionH relativeFrom="page">
-                          <wp:posOffset>154940</wp:posOffset>
-                        </wp:positionH>
-                      </mc:Fallback>
-                    </mc:AlternateContent>
-                    <mc:AlternateContent>
-                      <mc:Choice Requires="wp14">
-                        <wp:positionV relativeFrom="page">
-                          <wp14:pctPosVOffset>2000</wp14:pctPosVOffset>
-                        </wp:positionV>
-                      </mc:Choice>
-                      <mc:Fallback>
-                        <wp:positionV relativeFrom="page">
-                          <wp:posOffset>200660</wp:posOffset>
-                        </wp:positionV>
-                      </mc:Fallback>
-                    </mc:AlternateContent>
-                    <wp:extent cx="5363210" cy="9653270"/>
-                    <wp:effectExtent l="0" t="0" r="8890" b="2540"/>
+                    <wp:positionH relativeFrom="page">
+                      <wp:align>center</wp:align>
+                    </wp:positionH>
+                    <wp:positionV relativeFrom="page">
+                      <wp:align>center</wp:align>
+                    </wp:positionV>
+                    <wp:extent cx="6864824" cy="9123528"/>
+                    <wp:effectExtent l="0" t="0" r="2540" b="635"/>
                     <wp:wrapNone/>
-                    <wp:docPr id="471" name="Rectangle 16"/>
-                    <wp:cNvGraphicFramePr>
-                      <a:graphicFrameLocks xmlns:a="http://schemas.openxmlformats.org/drawingml/2006/main"/>
-                    </wp:cNvGraphicFramePr>
+                    <wp:docPr id="193" name="Group 198"/>
+                    <wp:cNvGraphicFramePr/>
                     <a:graphic xmlns:a="http://schemas.openxmlformats.org/drawingml/2006/main">
-                      <a:graphicData uri="http://schemas.microsoft.com/office/word/2010/wordprocessingShape">
-                        <wps:wsp>
-                          <wps:cNvSpPr>
-                            <a:spLocks/>
-                          </wps:cNvSpPr>
-                          <wps:spPr bwMode="auto">
+                      <a:graphicData uri="http://schemas.microsoft.com/office/word/2010/wordprocessingGroup">
+                        <wpg:wgp>
+                          <wpg:cNvGrpSpPr/>
+                          <wpg:grpSpPr>
                             <a:xfrm>
                               <a:off x="0" y="0"/>
-                              <a:ext cx="5363210" cy="9653270"/>
+                              <a:ext cx="6864824" cy="9123528"/>
+                              <a:chOff x="0" y="0"/>
+                              <a:chExt cx="6864824" cy="9123528"/>
                             </a:xfrm>
-                            <a:prstGeom prst="rect">
-                              <a:avLst/>
-                            </a:prstGeom>
-                            <a:solidFill>
-                              <a:schemeClr val="accent3">
-                                <a:lumMod val="50000"/>
-                              </a:schemeClr>
-                            </a:solidFill>
-                            <a:ln>
-                              <a:noFill/>
-                            </a:ln>
-                          </wps:spPr>
-                          <wps:txbx>
-                            <w:txbxContent>
-                              <w:sdt>
-                                <w:sdtPr>
-                                  <w:rPr>
-                                    <w:caps/>
-                                    <w:color w:val="FFFFFF" w:themeColor="background1"/>
-                                    <w:sz w:val="80"/>
-                                    <w:szCs w:val="80"/>
-                                  </w:rPr>
-                                  <w:alias w:val="Title"/>
-                                  <w:id w:val="-1275550102"/>
-                                  <w:dataBinding w:prefixMappings="xmlns:ns0='http://schemas.openxmlformats.org/package/2006/metadata/core-properties' xmlns:ns1='http://purl.org/dc/elements/1.1/'" w:xpath="/ns0:coreProperties[1]/ns1:title[1]" w:storeItemID="{6C3C8BC8-F283-45AE-878A-BAB7291924A1}"/>
-                                  <w:text/>
-                                </w:sdtPr>
-                                <w:sdtContent>
-                                  <w:p>
-                                    <w:pPr>
-                                      <w:pStyle w:val="Title"/>
-                                      <w:jc w:val="center"/>
+                          </wpg:grpSpPr>
+                          <wps:wsp>
+                            <wps:cNvPr id="194" name="Rectangle 194"/>
+                            <wps:cNvSpPr/>
+                            <wps:spPr>
+                              <a:xfrm>
+                                <a:off x="0" y="0"/>
+                                <a:ext cx="6858000" cy="1371600"/>
+                              </a:xfrm>
+                              <a:prstGeom prst="rect">
+                                <a:avLst/>
+                              </a:prstGeom>
+                              <a:solidFill>
+                                <a:schemeClr val="accent1"/>
+                              </a:solidFill>
+                              <a:ln>
+                                <a:noFill/>
+                              </a:ln>
+                            </wps:spPr>
+                            <wps:style>
+                              <a:lnRef idx="2">
+                                <a:schemeClr val="accent1">
+                                  <a:shade val="50000"/>
+                                </a:schemeClr>
+                              </a:lnRef>
+                              <a:fillRef idx="1">
+                                <a:schemeClr val="accent1"/>
+                              </a:fillRef>
+                              <a:effectRef idx="0">
+                                <a:schemeClr val="accent1"/>
+                              </a:effectRef>
+                              <a:fontRef idx="minor">
+                                <a:schemeClr val="lt1"/>
+                              </a:fontRef>
+                            </wps:style>
+                            <wps:bodyPr rot="0" spcFirstLastPara="0" vertOverflow="overflow" horzOverflow="overflow" vert="horz" wrap="square" lIns="91440" tIns="45720" rIns="91440" bIns="45720" numCol="1" spcCol="0" rtlCol="0" fromWordArt="0" anchor="ctr" anchorCtr="0" forceAA="0" compatLnSpc="1">
+                              <a:prstTxWarp prst="textNoShape">
+                                <a:avLst/>
+                              </a:prstTxWarp>
+                              <a:noAutofit/>
+                            </wps:bodyPr>
+                          </wps:wsp>
+                          <wps:wsp>
+                            <wps:cNvPr id="195" name="Rectangle 195"/>
+                            <wps:cNvSpPr/>
+                            <wps:spPr>
+                              <a:xfrm>
+                                <a:off x="0" y="4094328"/>
+                                <a:ext cx="6858000" cy="5029200"/>
+                              </a:xfrm>
+                              <a:prstGeom prst="rect">
+                                <a:avLst/>
+                              </a:prstGeom>
+                              <a:solidFill>
+                                <a:schemeClr val="accent1"/>
+                              </a:solidFill>
+                              <a:ln>
+                                <a:noFill/>
+                              </a:ln>
+                            </wps:spPr>
+                            <wps:style>
+                              <a:lnRef idx="2">
+                                <a:schemeClr val="accent1">
+                                  <a:shade val="50000"/>
+                                </a:schemeClr>
+                              </a:lnRef>
+                              <a:fillRef idx="1">
+                                <a:schemeClr val="accent1"/>
+                              </a:fillRef>
+                              <a:effectRef idx="0">
+                                <a:schemeClr val="accent1"/>
+                              </a:effectRef>
+                              <a:fontRef idx="minor">
+                                <a:schemeClr val="lt1"/>
+                              </a:fontRef>
+                            </wps:style>
+                            <wps:txbx>
+                              <w:txbxContent>
+                                <w:sdt>
+                                  <w:sdtPr>
+                                    <w:rPr>
+                                      <w:color w:val="FFFFFF" w:themeColor="background1"/>
+                                    </w:rPr>
+                                    <w:alias w:val="Author"/>
+                                    <w:tag w:val=""/>
+                                    <w:id w:val="945428907"/>
+                                    <w:dataBinding w:prefixMappings="xmlns:ns0='http://purl.org/dc/elements/1.1/' xmlns:ns1='http://schemas.openxmlformats.org/package/2006/metadata/core-properties' " w:xpath="/ns1:coreProperties[1]/ns0:creator[1]" w:storeItemID="{6C3C8BC8-F283-45AE-878A-BAB7291924A1}"/>
+                                    <w:text/>
+                                  </w:sdtPr>
+                                  <w:sdtContent>
+                                    <w:p>
+                                      <w:pPr>
+                                        <w:pStyle w:val="NoSpacing"/>
+                                        <w:spacing w:before="120"/>
+                                        <w:jc w:val="center"/>
+                                        <w:rPr>
+                                          <w:color w:val="FFFFFF" w:themeColor="background1"/>
+                                        </w:rPr>
+                                      </w:pPr>
+                                      <w:r>
+                                        <w:rPr>
+                                          <w:color w:val="FFFFFF" w:themeColor="background1"/>
+                                        </w:rPr>
+                                        <w:t>Antoine, Savannah</w:t>
+                                      </w:r>
+                                    </w:p>
+                                  </w:sdtContent>
+                                </w:sdt>
+                                <w:p>
+                                  <w:pPr>
+                                    <w:pStyle w:val="NoSpacing"/>
+                                    <w:spacing w:before="120"/>
+                                    <w:jc w:val="center"/>
+                                    <w:rPr>
+                                      <w:color w:val="FFFFFF" w:themeColor="background1"/>
+                                    </w:rPr>
+                                  </w:pPr>
+                                  <w:sdt>
+                                    <w:sdtPr>
                                       <w:rPr>
                                         <w:caps/>
                                         <w:color w:val="FFFFFF" w:themeColor="background1"/>
-                                        <w:sz w:val="80"/>
-                                        <w:szCs w:val="80"/>
                                       </w:rPr>
-                                    </w:pPr>
-                                    <w:r>
-                                      <w:rPr>
-                                        <w:caps/>
-                                        <w:color w:val="FFFFFF" w:themeColor="background1"/>
-                                        <w:sz w:val="80"/>
-                                        <w:szCs w:val="80"/>
-                                      </w:rPr>
-                                      <w:t>secure Network Expansion Proposal</w:t>
-                                    </w:r>
-                                  </w:p>
-                                </w:sdtContent>
-                              </w:sdt>
-                              <w:p>
-                                <w:pPr>
-                                  <w:spacing w:before="240"/>
-                                  <w:ind w:left="720"/>
-                                  <w:jc w:val="right"/>
-                                  <w:rPr>
-                                    <w:color w:val="FFFFFF" w:themeColor="background1"/>
-                                  </w:rPr>
-                                </w:pPr>
-                              </w:p>
-                              <w:sdt>
-                                <w:sdtPr>
-                                  <w:rPr>
-                                    <w:color w:val="FFFFFF" w:themeColor="background1"/>
-                                    <w:sz w:val="21"/>
-                                    <w:szCs w:val="21"/>
-                                  </w:rPr>
-                                  <w:alias w:val="Abstract"/>
-                                  <w:id w:val="-1812170092"/>
-                                  <w:showingPlcHdr/>
-                                  <w:dataBinding w:prefixMappings="xmlns:ns0='http://schemas.microsoft.com/office/2006/coverPageProps'" w:xpath="/ns0:CoverPageProperties[1]/ns0:Abstract[1]" w:storeItemID="{55AF091B-3C7A-41E3-B477-F2FDAA23CFDA}"/>
-                                  <w:text/>
-                                </w:sdtPr>
-                                <w:sdtContent>
-                                  <w:p>
-                                    <w:pPr>
-                                      <w:spacing w:before="240"/>
-                                      <w:ind w:left="1008"/>
-                                      <w:jc w:val="right"/>
+                                      <w:alias w:val="Company"/>
+                                      <w:tag w:val=""/>
+                                      <w:id w:val="1618182777"/>
+                                      <w:showingPlcHdr/>
+                                      <w:dataBinding w:prefixMappings="xmlns:ns0='http://schemas.openxmlformats.org/officeDocument/2006/extended-properties' " w:xpath="/ns0:Properties[1]/ns0:Company[1]" w:storeItemID="{6668398D-A668-4E3E-A5EB-62B293D839F1}"/>
+                                      <w:text/>
+                                    </w:sdtPr>
+                                    <w:sdtContent>
+                                      <w:r>
+                                        <w:rPr>
+                                          <w:caps/>
+                                          <w:color w:val="FFFFFF" w:themeColor="background1"/>
+                                        </w:rPr>
+                                        <w:t>[Company name]</w:t>
+                                      </w:r>
+                                    </w:sdtContent>
+                                  </w:sdt>
+                                  <w:r>
+                                    <w:rPr>
+                                      <w:color w:val="FFFFFF" w:themeColor="background1"/>
+                                    </w:rPr>
+                                    <w:t>  </w:t>
+                                  </w:r>
+                                  <w:sdt>
+                                    <w:sdtPr>
                                       <w:rPr>
                                         <w:color w:val="FFFFFF" w:themeColor="background1"/>
                                       </w:rPr>
-                                    </w:pPr>
-                                    <w:r>
-                                      <w:rPr>
-                                        <w:color w:val="FFFFFF" w:themeColor="background1"/>
-                                        <w:sz w:val="21"/>
-                                        <w:szCs w:val="21"/>
-                                      </w:rPr>
-                                      <w:t>[Draw your reader in with an engaging abstract. It is typically a short summary of the document. When you’re ready to add your content, just click here and start typing.]</w:t>
-                                    </w:r>
-                                  </w:p>
-                                </w:sdtContent>
-                              </w:sdt>
-                            </w:txbxContent>
-                          </wps:txbx>
-                          <wps:bodyPr rot="0" vert="horz" wrap="square" lIns="274320" tIns="914400" rIns="274320" bIns="45720" anchor="ctr" anchorCtr="0" upright="1">
-                            <a:noAutofit/>
-                          </wps:bodyPr>
-                        </wps:wsp>
+                                      <w:alias w:val="Address"/>
+                                      <w:tag w:val=""/>
+                                      <w:id w:val="-253358678"/>
+                                      <w:showingPlcHdr/>
+                                      <w:dataBinding w:prefixMappings="xmlns:ns0='http://schemas.microsoft.com/office/2006/coverPageProps' " w:xpath="/ns0:CoverPageProperties[1]/ns0:CompanyAddress[1]" w:storeItemID="{55AF091B-3C7A-41E3-B477-F2FDAA23CFDA}"/>
+                                      <w:text/>
+                                    </w:sdtPr>
+                                    <w:sdtContent>
+                                      <w:r>
+                                        <w:rPr>
+                                          <w:color w:val="FFFFFF" w:themeColor="background1"/>
+                                        </w:rPr>
+                                        <w:t>[Company address]</w:t>
+                                      </w:r>
+                                    </w:sdtContent>
+                                  </w:sdt>
+                                </w:p>
+                              </w:txbxContent>
+                            </wps:txbx>
+                            <wps:bodyPr rot="0" spcFirstLastPara="0" vertOverflow="overflow" horzOverflow="overflow" vert="horz" wrap="square" lIns="457200" tIns="731520" rIns="457200" bIns="457200" numCol="1" spcCol="0" rtlCol="0" fromWordArt="0" anchor="b" anchorCtr="0" forceAA="0" compatLnSpc="1">
+                              <a:prstTxWarp prst="textNoShape">
+                                <a:avLst/>
+                              </a:prstTxWarp>
+                              <a:noAutofit/>
+                            </wps:bodyPr>
+                          </wps:wsp>
+                          <wps:wsp>
+                            <wps:cNvPr id="196" name="Text Box 196"/>
+                            <wps:cNvSpPr txBox="1"/>
+                            <wps:spPr>
+                              <a:xfrm>
+                                <a:off x="6824" y="1371600"/>
+                                <a:ext cx="6858000" cy="2722728"/>
+                              </a:xfrm>
+                              <a:prstGeom prst="rect">
+                                <a:avLst/>
+                              </a:prstGeom>
+                              <a:solidFill>
+                                <a:schemeClr val="bg1"/>
+                              </a:solidFill>
+                              <a:ln w="6350">
+                                <a:noFill/>
+                              </a:ln>
+                              <a:effectLst/>
+                            </wps:spPr>
+                            <wps:style>
+                              <a:lnRef idx="0">
+                                <a:schemeClr val="accent1"/>
+                              </a:lnRef>
+                              <a:fillRef idx="0">
+                                <a:schemeClr val="accent1"/>
+                              </a:fillRef>
+                              <a:effectRef idx="0">
+                                <a:schemeClr val="accent1"/>
+                              </a:effectRef>
+                              <a:fontRef idx="minor">
+                                <a:schemeClr val="dk1"/>
+                              </a:fontRef>
+                            </wps:style>
+                            <wps:txbx>
+                              <w:txbxContent>
+                                <w:sdt>
+                                  <w:sdtPr>
+                                    <w:rPr>
+                                      <w:rFonts w:ascii="Amasis MT Pro Medium" w:eastAsiaTheme="majorEastAsia" w:hAnsi="Amasis MT Pro Medium" w:cstheme="majorBidi"/>
+                                      <w:caps/>
+                                      <w:color w:val="156082" w:themeColor="accent1"/>
+                                      <w:sz w:val="72"/>
+                                      <w:szCs w:val="72"/>
+                                    </w:rPr>
+                                    <w:alias w:val="Title"/>
+                                    <w:tag w:val=""/>
+                                    <w:id w:val="-9991715"/>
+                                    <w:dataBinding w:prefixMappings="xmlns:ns0='http://purl.org/dc/elements/1.1/' xmlns:ns1='http://schemas.openxmlformats.org/package/2006/metadata/core-properties' " w:xpath="/ns1:coreProperties[1]/ns0:title[1]" w:storeItemID="{6C3C8BC8-F283-45AE-878A-BAB7291924A1}"/>
+                                    <w:text/>
+                                  </w:sdtPr>
+                                  <w:sdtContent>
+                                    <w:p>
+                                      <w:pPr>
+                                        <w:pStyle w:val="NoSpacing"/>
+                                        <w:jc w:val="center"/>
+                                        <w:rPr>
+                                          <w:rFonts w:ascii="Amasis MT Pro Medium" w:eastAsiaTheme="majorEastAsia" w:hAnsi="Amasis MT Pro Medium" w:cstheme="majorBidi"/>
+                                          <w:caps/>
+                                          <w:color w:val="156082" w:themeColor="accent1"/>
+                                          <w:sz w:val="72"/>
+                                          <w:szCs w:val="72"/>
+                                        </w:rPr>
+                                      </w:pPr>
+                                      <w:r>
+                                        <w:rPr>
+                                          <w:rFonts w:ascii="Amasis MT Pro Medium" w:eastAsiaTheme="majorEastAsia" w:hAnsi="Amasis MT Pro Medium" w:cstheme="majorBidi"/>
+                                          <w:caps/>
+                                          <w:color w:val="156082" w:themeColor="accent1"/>
+                                          <w:sz w:val="72"/>
+                                          <w:szCs w:val="72"/>
+                                        </w:rPr>
+                                        <w:t>secure Network Expansion Proposal</w:t>
+                                      </w:r>
+                                    </w:p>
+                                  </w:sdtContent>
+                                </w:sdt>
+                              </w:txbxContent>
+                            </wps:txbx>
+                            <wps:bodyPr rot="0" spcFirstLastPara="0" vertOverflow="overflow" horzOverflow="overflow" vert="horz" wrap="square" lIns="457200" tIns="91440" rIns="457200" bIns="91440" numCol="1" spcCol="0" rtlCol="0" fromWordArt="0" anchor="ctr" anchorCtr="0" forceAA="0" compatLnSpc="1">
+                              <a:prstTxWarp prst="textNoShape">
+                                <a:avLst/>
+                              </a:prstTxWarp>
+                              <a:noAutofit/>
+                            </wps:bodyPr>
+                          </wps:wsp>
+                        </wpg:wgp>
                       </a:graphicData>
                     </a:graphic>
                     <wp14:sizeRelH relativeFrom="page">
-                      <wp14:pctWidth>69000</wp14:pctWidth>
+                      <wp14:pctWidth>88200</wp14:pctWidth>
                     </wp14:sizeRelH>
                     <wp14:sizeRelV relativeFrom="page">
-                      <wp14:pctHeight>96000</wp14:pctHeight>
+                      <wp14:pctHeight>90900</wp14:pctHeight>
                     </wp14:sizeRelV>
                   </wp:anchor>
                 </w:drawing>
               </mc:Choice>
               <mc:Fallback>
                 <w:pict>
-                  <v:rect w14:anchorId="3FF4DD4F" id="Rectangle 16" o:spid="_x0000_s1026" style="position:absolute;margin-left:0;margin-top:0;width:422.3pt;height:760.1pt;z-index:251659264;visibility:visible;mso-wrap-style:square;mso-width-percent:690;mso-height-percent:960;mso-left-percent:20;mso-top-percent:20;mso-wrap-distance-left:9pt;mso-wrap-distance-top:0;mso-wrap-distance-right:9pt;mso-wrap-distance-bottom:0;mso-position-horizontal-relative:page;mso-position-vertical-relative:page;mso-width-percent:690;mso-height-percent:960;mso-left-percent:20;mso-top-percent:20;mso-width-relative:page;mso-height-relative:page;v-text-anchor:middle" o:gfxdata="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" fillcolor="#0c3511 [1606]" stroked="f">
-                    <v:textbox inset="21.6pt,1in,21.6pt">
-                      <w:txbxContent>
-                        <w:sdt>
-                          <w:sdtPr>
-                            <w:rPr>
-                              <w:caps/>
-                              <w:color w:val="FFFFFF" w:themeColor="background1"/>
-                              <w:sz w:val="80"/>
-                              <w:szCs w:val="80"/>
-                            </w:rPr>
-                            <w:alias w:val="Title"/>
-                            <w:id w:val="-1275550102"/>
-                            <w:dataBinding w:prefixMappings="xmlns:ns0='http://schemas.openxmlformats.org/package/2006/metadata/core-properties' xmlns:ns1='http://purl.org/dc/elements/1.1/'" w:xpath="/ns0:coreProperties[1]/ns1:title[1]" w:storeItemID="{6C3C8BC8-F283-45AE-878A-BAB7291924A1}"/>
-                            <w:text/>
-                          </w:sdtPr>
-                          <w:sdtContent>
-                            <w:p>
-                              <w:pPr>
-                                <w:pStyle w:val="Title"/>
-                                <w:jc w:val="center"/>
+                  <v:group w14:anchorId="291A24B8" id="Group 198" o:spid="_x0000_s1026" style="position:absolute;margin-left:0;margin-top:0;width:540.55pt;height:718.4pt;z-index:-251652096;mso-width-percent:882;mso-height-percent:909;mso-position-horizontal:center;mso-position-horizontal-relative:page;mso-position-vertical:center;mso-position-vertical-relative:page;mso-width-percent:882;mso-height-percent:909" coordsize="68648,91235" o:gfxdata="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">
+                    <v:rect id="Rectangle 194" o:spid="_x0000_s1027" style="position:absolute;width:68580;height:13716;visibility:visible;mso-wrap-style:square;v-text-anchor:middle" o:gfxdata="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" fillcolor="#156082 [3204]" stroked="f" strokeweight="1.5pt"/>
+                    <v:rect id="Rectangle 195" o:spid="_x0000_s1028" style="position:absolute;top:40943;width:68580;height:50292;visibility:visible;mso-wrap-style:square;v-text-anchor:bottom" o:gfxdata="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" fillcolor="#156082 [3204]" stroked="f" strokeweight="1.5pt">
+                      <v:textbox inset="36pt,57.6pt,36pt,36pt">
+                        <w:txbxContent>
+                          <w:sdt>
+                            <w:sdtPr>
+                              <w:rPr>
+                                <w:color w:val="FFFFFF" w:themeColor="background1"/>
+                              </w:rPr>
+                              <w:alias w:val="Author"/>
+                              <w:tag w:val=""/>
+                              <w:id w:val="945428907"/>
+                              <w:dataBinding w:prefixMappings="xmlns:ns0='http://purl.org/dc/elements/1.1/' xmlns:ns1='http://schemas.openxmlformats.org/package/2006/metadata/core-properties' " w:xpath="/ns1:coreProperties[1]/ns0:creator[1]" w:storeItemID="{6C3C8BC8-F283-45AE-878A-BAB7291924A1}"/>
+                              <w:text/>
+                            </w:sdtPr>
+                            <w:sdtContent>
+                              <w:p>
+                                <w:pPr>
+                                  <w:pStyle w:val="NoSpacing"/>
+                                  <w:spacing w:before="120"/>
+                                  <w:jc w:val="center"/>
+                                  <w:rPr>
+                                    <w:color w:val="FFFFFF" w:themeColor="background1"/>
+                                  </w:rPr>
+                                </w:pPr>
+                                <w:r>
+                                  <w:rPr>
+                                    <w:color w:val="FFFFFF" w:themeColor="background1"/>
+                                  </w:rPr>
+                                  <w:t>Antoine, Savannah</w:t>
+                                </w:r>
+                              </w:p>
+                            </w:sdtContent>
+                          </w:sdt>
+                          <w:p>
+                            <w:pPr>
+                              <w:pStyle w:val="NoSpacing"/>
+                              <w:spacing w:before="120"/>
+                              <w:jc w:val="center"/>
+                              <w:rPr>
+                                <w:color w:val="FFFFFF" w:themeColor="background1"/>
+                              </w:rPr>
+                            </w:pPr>
+                            <w:sdt>
+                              <w:sdtPr>
                                 <w:rPr>
                                   <w:caps/>
                                   <w:color w:val="FFFFFF" w:themeColor="background1"/>
-                                  <w:sz w:val="80"/>
-                                  <w:szCs w:val="80"/>
                                 </w:rPr>
-                              </w:pPr>
-                              <w:r>
-                                <w:rPr>
-                                  <w:caps/>
-                                  <w:color w:val="FFFFFF" w:themeColor="background1"/>
-                                  <w:sz w:val="80"/>
-                                  <w:szCs w:val="80"/>
-                                </w:rPr>
-                                <w:t>secure Network Expansion Proposal</w:t>
-                              </w:r>
-                            </w:p>
-                          </w:sdtContent>
-                        </w:sdt>
-                        <w:p>
-                          <w:pPr>
-                            <w:spacing w:before="240"/>
-                            <w:ind w:left="720"/>
-                            <w:jc w:val="right"/>
-                            <w:rPr>
-                              <w:color w:val="FFFFFF" w:themeColor="background1"/>
-                            </w:rPr>
-                          </w:pPr>
-                        </w:p>
-                        <w:sdt>
-                          <w:sdtPr>
-                            <w:rPr>
-                              <w:color w:val="FFFFFF" w:themeColor="background1"/>
-                              <w:sz w:val="21"/>
-                              <w:szCs w:val="21"/>
-                            </w:rPr>
-                            <w:alias w:val="Abstract"/>
-                            <w:id w:val="-1812170092"/>
-                            <w:showingPlcHdr/>
-                            <w:dataBinding w:prefixMappings="xmlns:ns0='http://schemas.microsoft.com/office/2006/coverPageProps'" w:xpath="/ns0:CoverPageProperties[1]/ns0:Abstract[1]" w:storeItemID="{55AF091B-3C7A-41E3-B477-F2FDAA23CFDA}"/>
-                            <w:text/>
-                          </w:sdtPr>
-                          <w:sdtContent>
-                            <w:p>
-                              <w:pPr>
-                                <w:spacing w:before="240"/>
-                                <w:ind w:left="1008"/>
-                                <w:jc w:val="right"/>
+                                <w:alias w:val="Company"/>
+                                <w:tag w:val=""/>
+                                <w:id w:val="1618182777"/>
+                                <w:showingPlcHdr/>
+                                <w:dataBinding w:prefixMappings="xmlns:ns0='http://schemas.openxmlformats.org/officeDocument/2006/extended-properties' " w:xpath="/ns0:Properties[1]/ns0:Company[1]" w:storeItemID="{6668398D-A668-4E3E-A5EB-62B293D839F1}"/>
+                                <w:text/>
+                              </w:sdtPr>
+                              <w:sdtContent>
+                                <w:r>
+                                  <w:rPr>
+                                    <w:caps/>
+                                    <w:color w:val="FFFFFF" w:themeColor="background1"/>
+                                  </w:rPr>
+                                  <w:t>[Company name]</w:t>
+                                </w:r>
+                              </w:sdtContent>
+                            </w:sdt>
+                            <w:r>
+                              <w:rPr>
+                                <w:color w:val="FFFFFF" w:themeColor="background1"/>
+                              </w:rPr>
+                              <w:t>  </w:t>
+                            </w:r>
+                            <w:sdt>
+                              <w:sdtPr>
                                 <w:rPr>
                                   <w:color w:val="FFFFFF" w:themeColor="background1"/>
                                 </w:rPr>
-                              </w:pPr>
-                              <w:r>
-                                <w:rPr>
-                                  <w:color w:val="FFFFFF" w:themeColor="background1"/>
-                                  <w:sz w:val="21"/>
-                                  <w:szCs w:val="21"/>
-                                </w:rPr>
-                                <w:t>[Draw your reader in with an engaging abstract. It is typically a short summary of the document. When you’re ready to add your content, just click here and start typing.]</w:t>
-                              </w:r>
-                            </w:p>
-                          </w:sdtContent>
-                        </w:sdt>
-                      </w:txbxContent>
-                    </v:textbox>
+                                <w:alias w:val="Address"/>
+                                <w:tag w:val=""/>
+                                <w:id w:val="-253358678"/>
+                                <w:showingPlcHdr/>
+                                <w:dataBinding w:prefixMappings="xmlns:ns0='http://schemas.microsoft.com/office/2006/coverPageProps' " w:xpath="/ns0:CoverPageProperties[1]/ns0:CompanyAddress[1]" w:storeItemID="{55AF091B-3C7A-41E3-B477-F2FDAA23CFDA}"/>
+                                <w:text/>
+                              </w:sdtPr>
+                              <w:sdtContent>
+                                <w:r>
+                                  <w:rPr>
+                                    <w:color w:val="FFFFFF" w:themeColor="background1"/>
+                                  </w:rPr>
+                                  <w:t>[Company address]</w:t>
+                                </w:r>
+                              </w:sdtContent>
+                            </w:sdt>
+                          </w:p>
+                        </w:txbxContent>
+                      </v:textbox>
+                    </v:rect>
+                    <v:shapetype id="_x0000_t202" coordsize="21600,21600" o:spt="202" path="m,l,21600r21600,l21600,xe">
+                      <v:stroke joinstyle="miter"/>
+                      <v:path gradientshapeok="t" o:connecttype="rect"/>
+                    </v:shapetype>
+                    <v:shape id="Text Box 196" o:spid="_x0000_s1029" type="#_x0000_t202" style="position:absolute;left:68;top:13716;width:68580;height:27227;visibility:visible;mso-wrap-style:square;v-text-anchor:middle" o:gfxdata="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" fillcolor="white [3212]" stroked="f" strokeweight=".5pt">
+                      <v:textbox inset="36pt,7.2pt,36pt,7.2pt">
+                        <w:txbxContent>
+                          <w:sdt>
+                            <w:sdtPr>
+                              <w:rPr>
+                                <w:rFonts w:ascii="Amasis MT Pro Medium" w:eastAsiaTheme="majorEastAsia" w:hAnsi="Amasis MT Pro Medium" w:cstheme="majorBidi"/>
+                                <w:caps/>
+                                <w:color w:val="156082" w:themeColor="accent1"/>
+                                <w:sz w:val="72"/>
+                                <w:szCs w:val="72"/>
+                              </w:rPr>
+                              <w:alias w:val="Title"/>
+                              <w:tag w:val=""/>
+                              <w:id w:val="-9991715"/>
+                              <w:dataBinding w:prefixMappings="xmlns:ns0='http://purl.org/dc/elements/1.1/' xmlns:ns1='http://schemas.openxmlformats.org/package/2006/metadata/core-properties' " w:xpath="/ns1:coreProperties[1]/ns0:title[1]" w:storeItemID="{6C3C8BC8-F283-45AE-878A-BAB7291924A1}"/>
+                              <w:text/>
+                            </w:sdtPr>
+                            <w:sdtContent>
+                              <w:p>
+                                <w:pPr>
+                                  <w:pStyle w:val="NoSpacing"/>
+                                  <w:jc w:val="center"/>
+                                  <w:rPr>
+                                    <w:rFonts w:ascii="Amasis MT Pro Medium" w:eastAsiaTheme="majorEastAsia" w:hAnsi="Amasis MT Pro Medium" w:cstheme="majorBidi"/>
+                                    <w:caps/>
+                                    <w:color w:val="156082" w:themeColor="accent1"/>
+                                    <w:sz w:val="72"/>
+                                    <w:szCs w:val="72"/>
+                                  </w:rPr>
+                                </w:pPr>
+                                <w:r>
+                                  <w:rPr>
+                                    <w:rFonts w:ascii="Amasis MT Pro Medium" w:eastAsiaTheme="majorEastAsia" w:hAnsi="Amasis MT Pro Medium" w:cstheme="majorBidi"/>
+                                    <w:caps/>
+                                    <w:color w:val="156082" w:themeColor="accent1"/>
+                                    <w:sz w:val="72"/>
+                                    <w:szCs w:val="72"/>
+                                  </w:rPr>
+                                  <w:t>secure Network Expansion Proposal</w:t>
+                                </w:r>
+                              </w:p>
+                            </w:sdtContent>
+                          </w:sdt>
+                        </w:txbxContent>
+                      </v:textbox>
+                    </v:shape>
                     <w10:wrap anchorx="page" anchory="page"/>
-                  </v:rect>
+                  </v:group>
                 </w:pict>
               </mc:Fallback>
             </mc:AlternateContent>
           </w:r>
+        </w:p>
+        <w:p>
+          <w:pPr>
+            <w:rPr>
+              <w:rFonts w:asciiTheme="majorHAnsi" w:eastAsiaTheme="majorEastAsia" w:hAnsiTheme="majorHAnsi" w:cstheme="majorBidi"/>
+              <w:caps/>
+              <w:color w:val="FFFFFF" w:themeColor="background1"/>
+              <w:spacing w:val="-10"/>
+              <w:kern w:val="28"/>
+              <w:sz w:val="80"/>
+              <w:szCs w:val="80"/>
+            </w:rPr>
+          </w:pPr>
           <w:r>
             <w:rPr>
+              <w:rFonts w:asciiTheme="majorHAnsi" w:eastAsiaTheme="majorEastAsia" w:hAnsiTheme="majorHAnsi" w:cstheme="majorBidi"/>
+              <w:caps/>
               <w:noProof/>
+              <w:color w:val="FFFFFF" w:themeColor="background1"/>
+              <w:spacing w:val="-10"/>
+              <w:kern w:val="28"/>
+              <w:sz w:val="80"/>
+              <w:szCs w:val="80"/>
             </w:rPr>
             <mc:AlternateContent>
               <mc:Choice Requires="wps">
                 <w:drawing>
-                  <wp:anchor distT="0" distB="0" distL="114300" distR="114300" simplePos="0" relativeHeight="251660288" behindDoc="0" locked="0" layoutInCell="1" allowOverlap="1" wp14:anchorId="7DE07D98" wp14:editId="248E94A2">
+                  <wp:anchor distT="0" distB="0" distL="114300" distR="114300" simplePos="0" relativeHeight="251665408" behindDoc="0" locked="0" layoutInCell="1" allowOverlap="1" wp14:anchorId="0BD4220D" wp14:editId="1FB180D5">
                     <wp:simplePos x="0" y="0"/>
-                    <mc:AlternateContent>
-                      <mc:Choice Requires="wp14">
-                        <wp:positionH relativeFrom="page">
-                          <wp14:pctPosHOffset>73000</wp14:pctPosHOffset>
-                        </wp:positionH>
-                      </mc:Choice>
-                      <mc:Fallback>
-                        <wp:positionH relativeFrom="page">
-                          <wp:posOffset>5673725</wp:posOffset>
-                        </wp:positionH>
-                      </mc:Fallback>
-                    </mc:AlternateContent>
-                    <wp:positionV relativeFrom="page">
-                      <wp:align>center</wp:align>
+                    <wp:positionH relativeFrom="column">
+                      <wp:posOffset>1021080</wp:posOffset>
+                    </wp:positionH>
+                    <wp:positionV relativeFrom="paragraph">
+                      <wp:posOffset>2753995</wp:posOffset>
                     </wp:positionV>
-                    <wp:extent cx="1880870" cy="9655810"/>
-                    <wp:effectExtent l="0" t="0" r="5080" b="2540"/>
+                    <wp:extent cx="4229100" cy="1905000"/>
+                    <wp:effectExtent l="0" t="0" r="0" b="0"/>
                     <wp:wrapNone/>
-                    <wp:docPr id="472" name="Rectangle 268"/>
-                    <wp:cNvGraphicFramePr>
-                      <a:graphicFrameLocks xmlns:a="http://schemas.openxmlformats.org/drawingml/2006/main"/>
-                    </wp:cNvGraphicFramePr>
+                    <wp:docPr id="285118412" name="Text Box 3"/>
+                    <wp:cNvGraphicFramePr/>
                     <a:graphic xmlns:a="http://schemas.openxmlformats.org/drawingml/2006/main">
                       <a:graphicData uri="http://schemas.microsoft.com/office/word/2010/wordprocessingShape">
                         <wps:wsp>
-                          <wps:cNvSpPr>
-                            <a:spLocks/>
-                          </wps:cNvSpPr>
+                          <wps:cNvSpPr txBox="1"/>
                           <wps:spPr>
                             <a:xfrm>
                               <a:off x="0" y="0"/>
-                              <a:ext cx="1880870" cy="9655810"/>
+                              <a:ext cx="4229100" cy="1905000"/>
                             </a:xfrm>
                             <a:prstGeom prst="rect">
                               <a:avLst/>
                             </a:prstGeom>
-                            <a:solidFill>
-                              <a:schemeClr val="accent6">
-                                <a:lumMod val="75000"/>
-                              </a:schemeClr>
-                            </a:solidFill>
-                            <a:ln>
+                            <a:noFill/>
+                            <a:ln w="6350">
                               <a:noFill/>
                             </a:ln>
                           </wps:spPr>
-                          <wps:style>
-                            <a:lnRef idx="2">
-                              <a:schemeClr val="accent1">
-                                <a:shade val="50000"/>
-                              </a:schemeClr>
-                            </a:lnRef>
-                            <a:fillRef idx="1">
-                              <a:schemeClr val="accent1"/>
-                            </a:fillRef>
-                            <a:effectRef idx="0">
-                              <a:schemeClr val="accent1"/>
-                            </a:effectRef>
-                            <a:fontRef idx="minor">
-                              <a:schemeClr val="lt1"/>
-                            </a:fontRef>
-                          </wps:style>
                           <wps:txbx>
                             <w:txbxContent>
-                              <w:sdt>
-                                <w:sdtPr>
+                              <w:p>
+                                <w:pPr>
+                                  <w:pStyle w:val="Subtitle"/>
                                   <w:rPr>
-                                    <w:rFonts w:cstheme="minorBidi"/>
-                                    <w:color w:val="FFFFFF" w:themeColor="background1"/>
+                                    <w:rFonts w:ascii="Amasis MT Pro Medium" w:hAnsi="Amasis MT Pro Medium"/>
+                                    <w:color w:val="0B769F" w:themeColor="accent4" w:themeShade="BF"/>
+                                    <w:lang w:val="en-US"/>
                                   </w:rPr>
-                                  <w:alias w:val="Subtitle"/>
-                                  <w:id w:val="-505288762"/>
-                                  <w:showingPlcHdr/>
-                                  <w:dataBinding w:prefixMappings="xmlns:ns0='http://schemas.openxmlformats.org/package/2006/metadata/core-properties' xmlns:ns1='http://purl.org/dc/elements/1.1/'" w:xpath="/ns0:coreProperties[1]/ns1:subject[1]" w:storeItemID="{6C3C8BC8-F283-45AE-878A-BAB7291924A1}"/>
-                                  <w:text/>
-                                </w:sdtPr>
-                                <w:sdtContent>
-                                  <w:p>
-                                    <w:pPr>
-                                      <w:pStyle w:val="Subtitle"/>
-                                      <w:rPr>
-                                        <w:rFonts w:cstheme="minorBidi"/>
-                                        <w:color w:val="FFFFFF" w:themeColor="background1"/>
-                                      </w:rPr>
-                                    </w:pPr>
-                                    <w:r>
-                                      <w:rPr>
-                                        <w:rFonts w:eastAsiaTheme="minorEastAsia" w:cstheme="minorBidi"/>
-                                        <w:color w:val="FFFFFF" w:themeColor="background1"/>
-                                      </w:rPr>
-                                      <w:t>[Document subtitle]</w:t>
-                                    </w:r>
-                                  </w:p>
-                                </w:sdtContent>
-                              </w:sdt>
+                                </w:pPr>
+                                <w:r>
+                                  <w:rPr>
+                                    <w:rFonts w:ascii="Amasis MT Pro Medium" w:hAnsi="Amasis MT Pro Medium"/>
+                                    <w:color w:val="0B769F" w:themeColor="accent4" w:themeShade="BF"/>
+                                    <w:lang w:val="en-US"/>
+                                  </w:rPr>
+                                  <w:t xml:space="preserve">By </w:t>
+                                </w:r>
+                                <w:r>
+                                  <w:rPr>
+                                    <w:rFonts w:ascii="Amasis MT Pro Medium" w:hAnsi="Amasis MT Pro Medium"/>
+                                    <w:color w:val="0B769F" w:themeColor="accent4" w:themeShade="BF"/>
+                                    <w:lang w:val="en-US"/>
+                                  </w:rPr>
+                                  <w:t>Ines Carpentier</w:t>
+                                </w:r>
+                                <w:r>
+                                  <w:rPr>
+                                    <w:rFonts w:ascii="Amasis MT Pro Medium" w:hAnsi="Amasis MT Pro Medium"/>
+                                    <w:color w:val="0B769F" w:themeColor="accent4" w:themeShade="BF"/>
+                                    <w:lang w:val="en-US"/>
+                                  </w:rPr>
+                                  <w:t>, Savannah Antoine</w:t>
+                                </w:r>
+                              </w:p>
+                              <w:p>
+                                <w:pPr>
+                                  <w:pStyle w:val="Subtitle"/>
+                                  <w:rPr>
+                                    <w:rFonts w:ascii="Amasis MT Pro Medium" w:hAnsi="Amasis MT Pro Medium"/>
+                                    <w:color w:val="0B769F" w:themeColor="accent4" w:themeShade="BF"/>
+                                    <w:lang w:val="en-US"/>
+                                  </w:rPr>
+                                </w:pPr>
+                              </w:p>
                             </w:txbxContent>
                           </wps:txbx>
-                          <wps:bodyPr rot="0" spcFirstLastPara="0" vertOverflow="overflow" horzOverflow="overflow" vert="horz" wrap="square" lIns="182880" tIns="45720" rIns="182880" bIns="45720" numCol="1" spcCol="0" rtlCol="0" fromWordArt="0" anchor="ctr" anchorCtr="0" forceAA="0" compatLnSpc="1">
+                          <wps:bodyPr rot="0" spcFirstLastPara="0" vertOverflow="overflow" horzOverflow="overflow" vert="horz" wrap="square" lIns="91440" tIns="45720" rIns="91440" bIns="45720" numCol="1" spcCol="0" rtlCol="0" fromWordArt="0" anchor="t" anchorCtr="0" forceAA="0" compatLnSpc="1">
                             <a:prstTxWarp prst="textNoShape">
                               <a:avLst/>
                             </a:prstTxWarp>
@@ -384,63 +600,78 @@
                         </wps:wsp>
                       </a:graphicData>
                     </a:graphic>
-                    <wp14:sizeRelH relativeFrom="page">
-                      <wp14:pctWidth>24200</wp14:pctWidth>
+                    <wp14:sizeRelH relativeFrom="margin">
+                      <wp14:pctWidth>0</wp14:pctWidth>
                     </wp14:sizeRelH>
-                    <wp14:sizeRelV relativeFrom="page">
-                      <wp14:pctHeight>96000</wp14:pctHeight>
-                    </wp14:sizeRelV>
                   </wp:anchor>
                 </w:drawing>
               </mc:Choice>
               <mc:Fallback>
                 <w:pict>
-                  <v:rect w14:anchorId="7DE07D98" id="Rectangle 268" o:spid="_x0000_s1027" style="position:absolute;margin-left:0;margin-top:0;width:148.1pt;height:760.3pt;z-index:251660288;visibility:visible;mso-wrap-style:square;mso-width-percent:242;mso-height-percent:960;mso-left-percent:730;mso-wrap-distance-left:9pt;mso-wrap-distance-top:0;mso-wrap-distance-right:9pt;mso-wrap-distance-bottom:0;mso-position-horizontal-relative:page;mso-position-vertical:center;mso-position-vertical-relative:page;mso-width-percent:242;mso-height-percent:960;mso-left-percent:730;mso-width-relative:page;mso-height-relative:page;v-text-anchor:middle" o:gfxdata="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" fillcolor="#3a7c22 [2409]" stroked="f" strokeweight="1.5pt">
-                    <v:textbox inset="14.4pt,,14.4pt">
+                  <v:shape w14:anchorId="0BD4220D" id="Text Box 3" o:spid="_x0000_s1030" type="#_x0000_t202" style="position:absolute;margin-left:80.4pt;margin-top:216.85pt;width:333pt;height:150pt;z-index:251665408;visibility:visible;mso-wrap-style:square;mso-width-percent:0;mso-wrap-distance-left:9pt;mso-wrap-distance-top:0;mso-wrap-distance-right:9pt;mso-wrap-distance-bottom:0;mso-position-horizontal:absolute;mso-position-horizontal-relative:text;mso-position-vertical:absolute;mso-position-vertical-relative:text;mso-width-percent:0;mso-width-relative:margin;v-text-anchor:top" o:gfxdata="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" filled="f" stroked="f" strokeweight=".5pt">
+                    <v:textbox>
                       <w:txbxContent>
-                        <w:sdt>
-                          <w:sdtPr>
+                        <w:p>
+                          <w:pPr>
+                            <w:pStyle w:val="Subtitle"/>
                             <w:rPr>
-                              <w:rFonts w:cstheme="minorBidi"/>
-                              <w:color w:val="FFFFFF" w:themeColor="background1"/>
+                              <w:rFonts w:ascii="Amasis MT Pro Medium" w:hAnsi="Amasis MT Pro Medium"/>
+                              <w:color w:val="0B769F" w:themeColor="accent4" w:themeShade="BF"/>
+                              <w:lang w:val="en-US"/>
                             </w:rPr>
-                            <w:alias w:val="Subtitle"/>
-                            <w:id w:val="-505288762"/>
-                            <w:showingPlcHdr/>
-                            <w:dataBinding w:prefixMappings="xmlns:ns0='http://schemas.openxmlformats.org/package/2006/metadata/core-properties' xmlns:ns1='http://purl.org/dc/elements/1.1/'" w:xpath="/ns0:coreProperties[1]/ns1:subject[1]" w:storeItemID="{6C3C8BC8-F283-45AE-878A-BAB7291924A1}"/>
-                            <w:text/>
-                          </w:sdtPr>
-                          <w:sdtContent>
-                            <w:p>
-                              <w:pPr>
-                                <w:pStyle w:val="Subtitle"/>
-                                <w:rPr>
-                                  <w:rFonts w:cstheme="minorBidi"/>
-                                  <w:color w:val="FFFFFF" w:themeColor="background1"/>
-                                </w:rPr>
-                              </w:pPr>
-                              <w:r>
-                                <w:rPr>
-                                  <w:rFonts w:eastAsiaTheme="minorEastAsia" w:cstheme="minorBidi"/>
-                                  <w:color w:val="FFFFFF" w:themeColor="background1"/>
-                                </w:rPr>
-                                <w:t>[Document subtitle]</w:t>
-                              </w:r>
-                            </w:p>
-                          </w:sdtContent>
-                        </w:sdt>
+                          </w:pPr>
+                          <w:r>
+                            <w:rPr>
+                              <w:rFonts w:ascii="Amasis MT Pro Medium" w:hAnsi="Amasis MT Pro Medium"/>
+                              <w:color w:val="0B769F" w:themeColor="accent4" w:themeShade="BF"/>
+                              <w:lang w:val="en-US"/>
+                            </w:rPr>
+                            <w:t xml:space="preserve">By </w:t>
+                          </w:r>
+                          <w:r>
+                            <w:rPr>
+                              <w:rFonts w:ascii="Amasis MT Pro Medium" w:hAnsi="Amasis MT Pro Medium"/>
+                              <w:color w:val="0B769F" w:themeColor="accent4" w:themeShade="BF"/>
+                              <w:lang w:val="en-US"/>
+                            </w:rPr>
+                            <w:t>Ines Carpentier</w:t>
+                          </w:r>
+                          <w:r>
+                            <w:rPr>
+                              <w:rFonts w:ascii="Amasis MT Pro Medium" w:hAnsi="Amasis MT Pro Medium"/>
+                              <w:color w:val="0B769F" w:themeColor="accent4" w:themeShade="BF"/>
+                              <w:lang w:val="en-US"/>
+                            </w:rPr>
+                            <w:t>, Savannah Antoine</w:t>
+                          </w:r>
+                        </w:p>
+                        <w:p>
+                          <w:pPr>
+                            <w:pStyle w:val="Subtitle"/>
+                            <w:rPr>
+                              <w:rFonts w:ascii="Amasis MT Pro Medium" w:hAnsi="Amasis MT Pro Medium"/>
+                              <w:color w:val="0B769F" w:themeColor="accent4" w:themeShade="BF"/>
+                              <w:lang w:val="en-US"/>
+                            </w:rPr>
+                          </w:pPr>
+                        </w:p>
                       </w:txbxContent>
                     </v:textbox>
-                    <w10:wrap anchorx="page" anchory="page"/>
-                  </v:rect>
+                  </v:shape>
                 </w:pict>
               </mc:Fallback>
             </mc:AlternateContent>
           </w:r>
-        </w:p>
-        <w:p/>
-        <w:p>
           <w:r>
+            <w:rPr>
+              <w:rFonts w:asciiTheme="majorHAnsi" w:eastAsiaTheme="majorEastAsia" w:hAnsiTheme="majorHAnsi" w:cstheme="majorBidi"/>
+              <w:caps/>
+              <w:color w:val="FFFFFF" w:themeColor="background1"/>
+              <w:spacing w:val="-10"/>
+              <w:kern w:val="28"/>
+              <w:sz w:val="80"/>
+              <w:szCs w:val="80"/>
+            </w:rPr>
             <w:br w:type="page"/>
           </w:r>
         </w:p>
@@ -493,7 +724,9 @@
               <w:tab w:val="right" w:leader="dot" w:pos="9350"/>
             </w:tabs>
             <w:rPr>
+              <w:rFonts w:eastAsiaTheme="minorEastAsia"/>
               <w:noProof/>
+              <w:lang w:eastAsia="en-CA"/>
             </w:rPr>
           </w:pPr>
           <w:r>
@@ -505,13 +738,224 @@
           <w:r>
             <w:fldChar w:fldCharType="separate"/>
           </w:r>
-          <w:hyperlink w:anchor="_Toc228437465" w:history="1">
+          <w:hyperlink w:anchor="_Toc229418982" w:history="1">
+            <w:r>
+              <w:rPr>
+                <w:rStyle w:val="Hyperlink"/>
+                <w:noProof/>
+              </w:rPr>
+              <w:t>Actual Situation</w:t>
+            </w:r>
+            <w:r>
+              <w:rPr>
+                <w:noProof/>
+                <w:webHidden/>
+              </w:rPr>
+              <w:tab/>
+            </w:r>
+            <w:r>
+              <w:rPr>
+                <w:noProof/>
+                <w:webHidden/>
+              </w:rPr>
+              <w:fldChar w:fldCharType="begin"/>
+            </w:r>
+            <w:r>
+              <w:rPr>
+                <w:noProof/>
+                <w:webHidden/>
+              </w:rPr>
+              <w:instrText xml:space="preserve"> PAGEREF _Toc229418982 \h </w:instrText>
+            </w:r>
+            <w:r>
+              <w:rPr>
+                <w:noProof/>
+                <w:webHidden/>
+              </w:rPr>
+            </w:r>
+            <w:r>
+              <w:rPr>
+                <w:noProof/>
+                <w:webHidden/>
+              </w:rPr>
+              <w:fldChar w:fldCharType="separate"/>
+            </w:r>
+            <w:r>
+              <w:rPr>
+                <w:noProof/>
+                <w:webHidden/>
+              </w:rPr>
+              <w:t>3</w:t>
+            </w:r>
+            <w:r>
+              <w:rPr>
+                <w:noProof/>
+                <w:webHidden/>
+              </w:rPr>
+              <w:fldChar w:fldCharType="end"/>
+            </w:r>
+          </w:hyperlink>
+        </w:p>
+        <w:p>
+          <w:pPr>
+            <w:pStyle w:val="TOC1"/>
+            <w:tabs>
+              <w:tab w:val="right" w:leader="dot" w:pos="9350"/>
+            </w:tabs>
+            <w:rPr>
+              <w:rFonts w:eastAsiaTheme="minorEastAsia"/>
+              <w:noProof/>
+              <w:lang w:eastAsia="en-CA"/>
+            </w:rPr>
+          </w:pPr>
+          <w:hyperlink w:anchor="_Toc229418983" w:history="1">
+            <w:r>
+              <w:rPr>
+                <w:rStyle w:val="Hyperlink"/>
+                <w:noProof/>
+              </w:rPr>
+              <w:t>Solution/Recommendation</w:t>
+            </w:r>
+            <w:r>
+              <w:rPr>
+                <w:noProof/>
+                <w:webHidden/>
+              </w:rPr>
+              <w:tab/>
+            </w:r>
+            <w:r>
+              <w:rPr>
+                <w:noProof/>
+                <w:webHidden/>
+              </w:rPr>
+              <w:fldChar w:fldCharType="begin"/>
+            </w:r>
+            <w:r>
+              <w:rPr>
+                <w:noProof/>
+                <w:webHidden/>
+              </w:rPr>
+              <w:instrText xml:space="preserve"> PAGEREF _Toc229418983 \h </w:instrText>
+            </w:r>
+            <w:r>
+              <w:rPr>
+                <w:noProof/>
+                <w:webHidden/>
+              </w:rPr>
+            </w:r>
+            <w:r>
+              <w:rPr>
+                <w:noProof/>
+                <w:webHidden/>
+              </w:rPr>
+              <w:fldChar w:fldCharType="separate"/>
+            </w:r>
+            <w:r>
+              <w:rPr>
+                <w:noProof/>
+                <w:webHidden/>
+              </w:rPr>
+              <w:t>4</w:t>
+            </w:r>
+            <w:r>
+              <w:rPr>
+                <w:noProof/>
+                <w:webHidden/>
+              </w:rPr>
+              <w:fldChar w:fldCharType="end"/>
+            </w:r>
+          </w:hyperlink>
+        </w:p>
+        <w:p>
+          <w:pPr>
+            <w:pStyle w:val="TOC1"/>
+            <w:tabs>
+              <w:tab w:val="right" w:leader="dot" w:pos="9350"/>
+            </w:tabs>
+            <w:rPr>
+              <w:rFonts w:eastAsiaTheme="minorEastAsia"/>
+              <w:noProof/>
+              <w:lang w:eastAsia="en-CA"/>
+            </w:rPr>
+          </w:pPr>
+          <w:hyperlink w:anchor="_Toc229418984" w:history="1">
             <w:r>
               <w:rPr>
                 <w:rStyle w:val="Hyperlink"/>
                 <w:rFonts w:ascii="Amasis MT Pro Medium" w:hAnsi="Amasis MT Pro Medium"/>
                 <w:noProof/>
               </w:rPr>
+              <w:t>Conclusions</w:t>
+            </w:r>
+            <w:r>
+              <w:rPr>
+                <w:noProof/>
+                <w:webHidden/>
+              </w:rPr>
+              <w:tab/>
+            </w:r>
+            <w:r>
+              <w:rPr>
+                <w:noProof/>
+                <w:webHidden/>
+              </w:rPr>
+              <w:fldChar w:fldCharType="begin"/>
+            </w:r>
+            <w:r>
+              <w:rPr>
+                <w:noProof/>
+                <w:webHidden/>
+              </w:rPr>
+              <w:instrText xml:space="preserve"> PAGEREF _Toc229418984 \h </w:instrText>
+            </w:r>
+            <w:r>
+              <w:rPr>
+                <w:noProof/>
+                <w:webHidden/>
+              </w:rPr>
+            </w:r>
+            <w:r>
+              <w:rPr>
+                <w:noProof/>
+                <w:webHidden/>
+              </w:rPr>
+              <w:fldChar w:fldCharType="separate"/>
+            </w:r>
+            <w:r>
+              <w:rPr>
+                <w:noProof/>
+                <w:webHidden/>
+              </w:rPr>
+              <w:t>5</w:t>
+            </w:r>
+            <w:r>
+              <w:rPr>
+                <w:noProof/>
+                <w:webHidden/>
+              </w:rPr>
+              <w:fldChar w:fldCharType="end"/>
+            </w:r>
+          </w:hyperlink>
+        </w:p>
+        <w:p>
+          <w:pPr>
+            <w:pStyle w:val="TOC1"/>
+            <w:tabs>
+              <w:tab w:val="right" w:leader="dot" w:pos="9350"/>
+            </w:tabs>
+            <w:rPr>
+              <w:rFonts w:eastAsiaTheme="minorEastAsia"/>
+              <w:noProof/>
+              <w:lang w:eastAsia="en-CA"/>
+            </w:rPr>
+          </w:pPr>
+          <w:hyperlink w:anchor="_Toc229418985" w:history="1">
+            <w:r>
+              <w:rPr>
+                <w:rStyle w:val="Hyperlink"/>
+                <w:rFonts w:ascii="Amasis MT Pro Medium" w:hAnsi="Amasis MT Pro Medium"/>
+                <w:noProof/>
+              </w:rPr>
               <w:t>Appendices</w:t>
             </w:r>
             <w:r>
@@ -533,7 +977,7 @@
                 <w:noProof/>
                 <w:webHidden/>
               </w:rPr>
-              <w:instrText xml:space="preserve"> PAGEREF _Toc228437465 \h </w:instrText>
+              <w:instrText xml:space="preserve"> PAGEREF _Toc229418985 \h </w:instrText>
             </w:r>
             <w:r>
               <w:rPr>
@@ -553,7 +997,7 @@
                 <w:noProof/>
                 <w:webHidden/>
               </w:rPr>
-              <w:t>2</w:t>
+              <w:t>6</w:t>
             </w:r>
             <w:r>
               <w:rPr>
@@ -582,200 +1026,59 @@
       </w:r>
     </w:p>
     <w:p>
-      <w:r>
+      <w:pPr>
+        <w:pStyle w:val="Heading1"/>
+        <w:jc w:val="center"/>
+      </w:pPr>
+      <w:bookmarkStart w:id="0" w:name="_Toc229418982"/>
+      <w:r>
+        <w:lastRenderedPageBreak/>
+        <w:t>Actual Situation</w:t>
+      </w:r>
+      <w:bookmarkEnd w:id="0"/>
+    </w:p>
+    <w:p>
+      <w:pPr>
         <w:rPr>
           <w:b/>
           <w:bCs/>
         </w:rPr>
+      </w:pPr>
+    </w:p>
+    <w:p>
+      <w:r>
+        <w:br w:type="page"/>
+      </w:r>
+    </w:p>
+    <w:p>
+      <w:pPr>
+        <w:pStyle w:val="Heading1"/>
+        <w:jc w:val="center"/>
+      </w:pPr>
+      <w:bookmarkStart w:id="1" w:name="_Toc229418983"/>
+      <w:r>
         <w:lastRenderedPageBreak/>
-        <w:t>Q: Why do you need our services? What are the problems with your current network?</w:t>
-      </w:r>
-    </w:p>
-    <w:p>
-      <w:r>
+        <w:t>Solution/Recommendation</w:t>
+      </w:r>
+      <w:bookmarkEnd w:id="1"/>
+    </w:p>
+    <w:p/>
+    <w:p>
+      <w:pPr>
         <w:rPr>
-          <w:b/>
-          <w:bCs/>
+          <w:rFonts w:ascii="Amasis MT Pro Medium" w:eastAsiaTheme="majorEastAsia" w:hAnsi="Amasis MT Pro Medium" w:cstheme="majorBidi"/>
+          <w:color w:val="0F4761" w:themeColor="accent1" w:themeShade="BF"/>
+          <w:sz w:val="40"/>
+          <w:szCs w:val="40"/>
         </w:rPr>
-        <w:t>A:</w:t>
-      </w:r>
-      <w:r>
-        <w:t xml:space="preserve"> We are planning an expansion and bought a new location approximately 12 km away from our main site. Our current network struggles with the massive imaging files we generate.</w:t>
-      </w:r>
-    </w:p>
-    <w:p>
+      </w:pPr>
       <w:r>
         <w:rPr>
-          <w:b/>
-          <w:bCs/>
+          <w:rFonts w:ascii="Amasis MT Pro Medium" w:hAnsi="Amasis MT Pro Medium"/>
         </w:rPr>
-        <w:t>Q: What are the requirements for the new location?</w:t>
-      </w:r>
-    </w:p>
-    <w:p>
-      <w:r>
-        <w:rPr>
-          <w:b/>
-          <w:bCs/>
-        </w:rPr>
-        <w:t>A:</w:t>
-      </w:r>
-      <w:r>
-        <w:t xml:space="preserve"> There is a constant need to connect to our high-resolution imaging database and the Patient Management System (PMS) hosted on our main servers.</w:t>
-      </w:r>
-    </w:p>
-    <w:p>
-      <w:r>
-        <w:rPr>
-          <w:b/>
-          <w:bCs/>
-        </w:rPr>
-        <w:t>Q: What services are currently hosted on your servers?</w:t>
-      </w:r>
-    </w:p>
-    <w:p>
-      <w:r>
-        <w:rPr>
-          <w:b/>
-          <w:bCs/>
-        </w:rPr>
-        <w:t>A:</w:t>
-      </w:r>
-      <w:r>
-        <w:t xml:space="preserve"> We host the PMS, a secure patient record database, and a lab result portal. Because our scans are </w:t>
-      </w:r>
-      <w:proofErr w:type="gramStart"/>
-      <w:r>
-        <w:t>high-detail</w:t>
-      </w:r>
-      <w:proofErr w:type="gramEnd"/>
-      <w:r>
-        <w:t>, we are quickly running out of storage space.</w:t>
-      </w:r>
-    </w:p>
-    <w:p>
-      <w:r>
-        <w:rPr>
-          <w:b/>
-          <w:bCs/>
-        </w:rPr>
-        <w:t>Q: How do the servers perform?</w:t>
-      </w:r>
-    </w:p>
-    <w:p>
-      <w:r>
-        <w:rPr>
-          <w:b/>
-          <w:bCs/>
-        </w:rPr>
-        <w:t>A:</w:t>
-      </w:r>
-      <w:r>
-        <w:t xml:space="preserve"> Services are stable, but we experience lag during large file transfers and don't know the cause.</w:t>
-      </w:r>
-    </w:p>
-    <w:p>
-      <w:r>
-        <w:rPr>
-          <w:b/>
-          <w:bCs/>
-        </w:rPr>
-        <w:t>Q: What is your stance on Cloud technologies?</w:t>
-      </w:r>
-    </w:p>
-    <w:p>
-      <w:r>
-        <w:rPr>
-          <w:b/>
-          <w:bCs/>
-        </w:rPr>
-        <w:t>A:</w:t>
-      </w:r>
-      <w:r>
-        <w:t xml:space="preserve"> We are not interested in cloud for this expansion. We require all primary data and infrastructure to be kept on-site due to strict medical privacy regulations and the physical size of our files. We prefer investing in hardware we own and maintain locally.</w:t>
-      </w:r>
-    </w:p>
-    <w:p>
-      <w:r>
-        <w:rPr>
-          <w:b/>
-          <w:bCs/>
-        </w:rPr>
-        <w:t>Q: Do you require Wi-Fi?</w:t>
-      </w:r>
-    </w:p>
-    <w:p>
-      <w:r>
-        <w:rPr>
-          <w:b/>
-          <w:bCs/>
-        </w:rPr>
-        <w:t>A:</w:t>
-      </w:r>
-      <w:r>
-        <w:t xml:space="preserve"> Yes, we need secure Wi-Fi for staff tablets and a separate guest network for patients at the new location.</w:t>
-      </w:r>
-    </w:p>
-    <w:p>
-      <w:r>
-        <w:rPr>
-          <w:b/>
-          <w:bCs/>
-        </w:rPr>
-        <w:t>Q: Other services that will use the connection?</w:t>
-      </w:r>
-    </w:p>
-    <w:p>
-      <w:r>
-        <w:rPr>
-          <w:b/>
-          <w:bCs/>
-        </w:rPr>
-        <w:t>A:</w:t>
-      </w:r>
-      <w:r>
-        <w:t xml:space="preserve"> Our doctors work on a hybrid schedule and need to review charts from home. It is essential to have secure VPN capabilities.</w:t>
-      </w:r>
-    </w:p>
-    <w:p>
-      <w:r>
-        <w:rPr>
-          <w:b/>
-          <w:bCs/>
-        </w:rPr>
-        <w:t>Q: How many departments and employees do you have?</w:t>
-      </w:r>
-    </w:p>
-    <w:p>
-      <w:r>
-        <w:rPr>
-          <w:b/>
-          <w:bCs/>
-        </w:rPr>
-        <w:t>A:</w:t>
-      </w:r>
-      <w:r>
-        <w:t xml:space="preserve"> Admin/Reception (4), Doctors (10), Nurses (1</w:t>
-      </w:r>
-      <w:r>
-        <w:t>6</w:t>
-      </w:r>
-      <w:r>
-        <w:t>), Lab Techs (20), IT (</w:t>
-      </w:r>
-      <w:r>
-        <w:t>2</w:t>
-      </w:r>
-      <w:r>
-        <w:t>). The new location will add half the size of our current staff.</w:t>
-      </w:r>
-    </w:p>
-    <w:p>
-      <w:r>
         <w:br w:type="page"/>
       </w:r>
     </w:p>
-    <w:p/>
     <w:p>
       <w:pPr>
         <w:pStyle w:val="Heading1"/>
@@ -784,11 +1087,46 @@
           <w:rFonts w:ascii="Amasis MT Pro Medium" w:hAnsi="Amasis MT Pro Medium"/>
         </w:rPr>
       </w:pPr>
-      <w:bookmarkStart w:id="0" w:name="_Toc228437465"/>
+      <w:bookmarkStart w:id="2" w:name="_Toc229418984"/>
       <w:r>
         <w:rPr>
           <w:rFonts w:ascii="Amasis MT Pro Medium" w:hAnsi="Amasis MT Pro Medium"/>
         </w:rPr>
+        <w:lastRenderedPageBreak/>
+        <w:t>Conclusions</w:t>
+      </w:r>
+      <w:bookmarkEnd w:id="2"/>
+    </w:p>
+    <w:p>
+      <w:pPr>
+        <w:rPr>
+          <w:rFonts w:ascii="Amasis MT Pro Medium" w:eastAsiaTheme="majorEastAsia" w:hAnsi="Amasis MT Pro Medium" w:cstheme="majorBidi"/>
+          <w:color w:val="0F4761" w:themeColor="accent1" w:themeShade="BF"/>
+          <w:sz w:val="40"/>
+          <w:szCs w:val="40"/>
+        </w:rPr>
+      </w:pPr>
+      <w:r>
+        <w:rPr>
+          <w:rFonts w:ascii="Amasis MT Pro Medium" w:hAnsi="Amasis MT Pro Medium"/>
+        </w:rPr>
+        <w:br w:type="page"/>
+      </w:r>
+    </w:p>
+    <w:p>
+      <w:pPr>
+        <w:pStyle w:val="Heading1"/>
+        <w:jc w:val="center"/>
+        <w:rPr>
+          <w:rFonts w:ascii="Amasis MT Pro Medium" w:hAnsi="Amasis MT Pro Medium"/>
+        </w:rPr>
+      </w:pPr>
+      <w:bookmarkStart w:id="3" w:name="_Toc229418985"/>
+      <w:r>
+        <w:rPr>
+          <w:rFonts w:ascii="Amasis MT Pro Medium" w:hAnsi="Amasis MT Pro Medium"/>
+        </w:rPr>
+        <w:lastRenderedPageBreak/>
         <w:t>Appendi</w:t>
       </w:r>
       <w:r>
@@ -797,7 +1135,7 @@
         </w:rPr>
         <w:t>ces</w:t>
       </w:r>
-      <w:bookmarkEnd w:id="0"/>
+      <w:bookmarkEnd w:id="3"/>
     </w:p>
     <w:p>
       <w:r>
@@ -815,38 +1153,314 @@
       <w:r>
         <w:t>VLAN</w:t>
       </w:r>
+      <w:r>
+        <w:t>:</w:t>
+      </w:r>
     </w:p>
     <w:p>
       <w:r>
         <w:t>VPN</w:t>
       </w:r>
+      <w:r>
+        <w:t>:</w:t>
+      </w:r>
     </w:p>
     <w:p>
       <w:r>
         <w:t>NAS</w:t>
       </w:r>
-    </w:p>
-    <w:p>
-      <w:r>
-        <w:t>Raid</w:t>
+      <w:r>
+        <w:t>:</w:t>
+      </w:r>
+    </w:p>
+    <w:p>
+      <w:r>
+        <w:t>R</w:t>
+      </w:r>
+      <w:r>
+        <w:t>AID</w:t>
+      </w:r>
+      <w:r>
+        <w:t>:</w:t>
       </w:r>
     </w:p>
     <w:p>
       <w:r>
         <w:t>VLSM</w:t>
       </w:r>
+      <w:r>
+        <w:t>:</w:t>
+      </w:r>
+    </w:p>
+    <w:p>
+      <w:r>
+        <w:t>Access Points</w:t>
+      </w:r>
+      <w:r>
+        <w:t>:</w:t>
+      </w:r>
+    </w:p>
+    <w:p>
+      <w:r>
+        <w:t>Network</w:t>
+      </w:r>
+      <w:r>
+        <w:t>:</w:t>
+      </w:r>
+    </w:p>
+    <w:p>
+      <w:r>
+        <w:t>Redundancy</w:t>
+      </w:r>
+      <w:r>
+        <w:t>:</w:t>
+      </w:r>
+    </w:p>
+    <w:p>
+      <w:r>
+        <w:t>Fiber Optic Cable</w:t>
+      </w:r>
+      <w:r>
+        <w:t>:</w:t>
+      </w:r>
+    </w:p>
+    <w:p>
+      <w:r>
+        <w:t>Topology</w:t>
+      </w:r>
+      <w:r>
+        <w:t>:</w:t>
+      </w:r>
+    </w:p>
+    <w:p>
+      <w:r>
+        <w:t>EMI</w:t>
+      </w:r>
+      <w:r>
+        <w:t>:</w:t>
+      </w:r>
+    </w:p>
+    <w:p>
+      <w:r>
+        <w:t>CAT</w:t>
+      </w:r>
+      <w:r>
+        <w:t>:</w:t>
+      </w:r>
+    </w:p>
+    <w:p>
+      <w:r>
+        <w:t>STP</w:t>
+      </w:r>
+      <w:r>
+        <w:t>:</w:t>
+      </w:r>
+    </w:p>
+    <w:p>
+      <w:r>
+        <w:t>Firewall</w:t>
+      </w:r>
+      <w:r>
+        <w:t>:</w:t>
+      </w:r>
+    </w:p>
+    <w:p>
+      <w:r>
+        <w:t>Inter-</w:t>
+      </w:r>
+      <w:proofErr w:type="spellStart"/>
+      <w:r>
+        <w:t>Vlan</w:t>
+      </w:r>
+      <w:proofErr w:type="spellEnd"/>
+      <w:r>
+        <w:t xml:space="preserve"> Routing</w:t>
+      </w:r>
+      <w:r>
+        <w:t>:</w:t>
+      </w:r>
+    </w:p>
+    <w:p>
+      <w:r>
+        <w:t>Server</w:t>
+      </w:r>
+      <w:r>
+        <w:t>:</w:t>
+      </w:r>
+    </w:p>
+    <w:p>
+      <w:r>
+        <w:t>DHCP</w:t>
+      </w:r>
+      <w:r>
+        <w:t>:</w:t>
+      </w:r>
+    </w:p>
+    <w:p>
+      <w:r>
+        <w:br/>
+      </w:r>
     </w:p>
     <w:p/>
-    <w:p>
-      <w:r>
+    <w:p/>
+    <w:p>
+      <w:pPr>
         <w:rPr>
           <w:b/>
           <w:bCs/>
         </w:rPr>
+      </w:pPr>
+    </w:p>
+    <w:p>
+      <w:pPr>
+        <w:rPr>
+          <w:b/>
+          <w:bCs/>
+        </w:rPr>
+      </w:pPr>
+    </w:p>
+    <w:p>
+      <w:pPr>
+        <w:rPr>
+          <w:b/>
+          <w:bCs/>
+        </w:rPr>
+      </w:pPr>
+      <w:r>
+        <w:rPr>
+          <w:b/>
+          <w:bCs/>
+        </w:rPr>
+        <w:br w:type="page"/>
+      </w:r>
+    </w:p>
+    <w:p>
+      <w:r>
+        <w:rPr>
+          <w:b/>
+          <w:bCs/>
+        </w:rPr>
+        <w:lastRenderedPageBreak/>
         <w:t>Appendix B:</w:t>
       </w:r>
       <w:r>
         <w:t xml:space="preserve"> Network Diagrams</w:t>
+      </w:r>
+    </w:p>
+    <w:p/>
+    <w:p>
+      <w:r>
+        <w:drawing>
+          <wp:anchor distT="0" distB="0" distL="114300" distR="114300" simplePos="0" relativeHeight="251662336" behindDoc="0" locked="0" layoutInCell="1" allowOverlap="1" wp14:anchorId="26300003" wp14:editId="11870A44">
+            <wp:simplePos x="0" y="0"/>
+            <wp:positionH relativeFrom="column">
+              <wp:posOffset>609600</wp:posOffset>
+            </wp:positionH>
+            <wp:positionV relativeFrom="paragraph">
+              <wp:posOffset>348615</wp:posOffset>
+            </wp:positionV>
+            <wp:extent cx="4631055" cy="3436620"/>
+            <wp:effectExtent l="0" t="0" r="0" b="0"/>
+            <wp:wrapTopAndBottom/>
+            <wp:docPr id="1984999022" name="Picture 1"/>
+            <wp:cNvGraphicFramePr>
+              <a:graphicFrameLocks xmlns:a="http://schemas.openxmlformats.org/drawingml/2006/main" noChangeAspect="1"/>
+            </wp:cNvGraphicFramePr>
+            <a:graphic xmlns:a="http://schemas.openxmlformats.org/drawingml/2006/main">
+              <a:graphicData uri="http://schemas.openxmlformats.org/drawingml/2006/picture">
+                <pic:pic xmlns:pic="http://schemas.openxmlformats.org/drawingml/2006/picture">
+                  <pic:nvPicPr>
+                    <pic:cNvPr id="1984999022" name=""/>
+                    <pic:cNvPicPr/>
+                  </pic:nvPicPr>
+                  <pic:blipFill>
+                    <a:blip r:embed="rId5">
+                      <a:extLst>
+                        <a:ext uri="{28A0092B-C50C-407E-A947-70E740481C1C}">
+                          <a14:useLocalDpi xmlns:a14="http://schemas.microsoft.com/office/drawing/2010/main" val="0"/>
+                        </a:ext>
+                      </a:extLst>
+                    </a:blip>
+                    <a:stretch>
+                      <a:fillRect/>
+                    </a:stretch>
+                  </pic:blipFill>
+                  <pic:spPr>
+                    <a:xfrm>
+                      <a:off x="0" y="0"/>
+                      <a:ext cx="4631055" cy="3436620"/>
+                    </a:xfrm>
+                    <a:prstGeom prst="rect">
+                      <a:avLst/>
+                    </a:prstGeom>
+                  </pic:spPr>
+                </pic:pic>
+              </a:graphicData>
+            </a:graphic>
+          </wp:anchor>
+        </w:drawing>
+      </w:r>
+      <w:r>
+        <w:t>Original Topology</w:t>
+      </w:r>
+    </w:p>
+    <w:p>
+      <w:r>
+        <w:drawing>
+          <wp:anchor distT="0" distB="0" distL="114300" distR="114300" simplePos="0" relativeHeight="251661312" behindDoc="0" locked="0" layoutInCell="1" allowOverlap="1" wp14:anchorId="3499E5C2" wp14:editId="6652E996">
+            <wp:simplePos x="0" y="0"/>
+            <wp:positionH relativeFrom="margin">
+              <wp:align>center</wp:align>
+            </wp:positionH>
+            <wp:positionV relativeFrom="paragraph">
+              <wp:posOffset>3789045</wp:posOffset>
+            </wp:positionV>
+            <wp:extent cx="4975860" cy="3441105"/>
+            <wp:effectExtent l="0" t="0" r="0" b="6985"/>
+            <wp:wrapTopAndBottom/>
+            <wp:docPr id="485848307" name="Picture 1"/>
+            <wp:cNvGraphicFramePr>
+              <a:graphicFrameLocks xmlns:a="http://schemas.openxmlformats.org/drawingml/2006/main" noChangeAspect="1"/>
+            </wp:cNvGraphicFramePr>
+            <a:graphic xmlns:a="http://schemas.openxmlformats.org/drawingml/2006/main">
+              <a:graphicData uri="http://schemas.openxmlformats.org/drawingml/2006/picture">
+                <pic:pic xmlns:pic="http://schemas.openxmlformats.org/drawingml/2006/picture">
+                  <pic:nvPicPr>
+                    <pic:cNvPr id="485848307" name=""/>
+                    <pic:cNvPicPr/>
+                  </pic:nvPicPr>
+                  <pic:blipFill>
+                    <a:blip r:embed="rId6">
+                      <a:extLst>
+                        <a:ext uri="{28A0092B-C50C-407E-A947-70E740481C1C}">
+                          <a14:useLocalDpi xmlns:a14="http://schemas.microsoft.com/office/drawing/2010/main" val="0"/>
+                        </a:ext>
+                      </a:extLst>
+                    </a:blip>
+                    <a:stretch>
+                      <a:fillRect/>
+                    </a:stretch>
+                  </pic:blipFill>
+                  <pic:spPr>
+                    <a:xfrm>
+                      <a:off x="0" y="0"/>
+                      <a:ext cx="4975860" cy="3441105"/>
+                    </a:xfrm>
+                    <a:prstGeom prst="rect">
+                      <a:avLst/>
+                    </a:prstGeom>
+                  </pic:spPr>
+                </pic:pic>
+              </a:graphicData>
+            </a:graphic>
+            <wp14:sizeRelH relativeFrom="margin">
+              <wp14:pctWidth>0</wp14:pctWidth>
+            </wp14:sizeRelH>
+            <wp14:sizeRelV relativeFrom="margin">
+              <wp14:pctHeight>0</wp14:pctHeight>
+            </wp14:sizeRelV>
+          </wp:anchor>
+        </w:drawing>
       </w:r>
     </w:p>
     <w:p/>
@@ -874,17 +1488,32 @@
     </w:p>
     <w:p>
       <w:r>
-        <w:t>Router</w:t>
+        <w:t>Tablets</w:t>
+      </w:r>
+    </w:p>
+    <w:p>
+      <w:r>
+        <w:t>Access Points</w:t>
+      </w:r>
+    </w:p>
+    <w:p>
+      <w:r>
+        <w:t>Fiber Optic Cabling</w:t>
+      </w:r>
+    </w:p>
+    <w:p>
+      <w:r>
+        <w:t>STP CAT 6</w:t>
       </w:r>
     </w:p>
     <w:sectPr>
       <w:pgSz w:w="12240" w:h="15840"/>
       <w:pgMar w:top="1440" w:right="1440" w:bottom="1440" w:left="1440" w:header="708" w:footer="708" w:gutter="0"/>
       <w:pgBorders w:offsetFrom="page">
-        <w:top w:val="single" w:sz="4" w:space="24" w:color="auto"/>
-        <w:left w:val="single" w:sz="4" w:space="24" w:color="auto"/>
-        <w:bottom w:val="single" w:sz="4" w:space="24" w:color="auto"/>
-        <w:right w:val="single" w:sz="4" w:space="24" w:color="auto"/>
+        <w:top w:val="single" w:sz="4" w:space="24" w:color="156082" w:themeColor="accent1"/>
+        <w:left w:val="single" w:sz="4" w:space="24" w:color="156082" w:themeColor="accent1"/>
+        <w:bottom w:val="single" w:sz="4" w:space="24" w:color="156082" w:themeColor="accent1"/>
+        <w:right w:val="single" w:sz="4" w:space="24" w:color="156082" w:themeColor="accent1"/>
       </w:pgBorders>
       <w:pgNumType w:start="0"/>
       <w:cols w:space="708"/>
@@ -1855,6 +2484,39 @@
       <w:u w:val="single"/>
     </w:rPr>
   </w:style>
+  <w:style w:type="paragraph" w:styleId="NoSpacing">
+    <w:name w:val="No Spacing"/>
+    <w:link w:val="NoSpacingChar"/>
+    <w:uiPriority w:val="1"/>
+    <w:qFormat/>
+    <w:rsid w:val="00971621"/>
+    <w:pPr>
+      <w:spacing w:after="0" w:line="240" w:lineRule="auto"/>
+    </w:pPr>
+    <w:rPr>
+      <w:rFonts w:eastAsiaTheme="minorEastAsia"/>
+      <w:kern w:val="0"/>
+      <w:sz w:val="22"/>
+      <w:szCs w:val="22"/>
+      <w:lang w:val="en-US"/>
+      <w14:ligatures w14:val="none"/>
+    </w:rPr>
+  </w:style>
+  <w:style w:type="character" w:customStyle="1" w:styleId="NoSpacingChar">
+    <w:name w:val="No Spacing Char"/>
+    <w:basedOn w:val="DefaultParagraphFont"/>
+    <w:link w:val="NoSpacing"/>
+    <w:uiPriority w:val="1"/>
+    <w:rsid w:val="00971621"/>
+    <w:rPr>
+      <w:rFonts w:eastAsiaTheme="minorEastAsia"/>
+      <w:kern w:val="0"/>
+      <w:sz w:val="22"/>
+      <w:szCs w:val="22"/>
+      <w:lang w:val="en-US"/>
+      <w14:ligatures w14:val="none"/>
+    </w:rPr>
+  </w:style>
 </w:styles>
 </file>
 

</xml_diff>

<commit_message>
Working on section about the solution
</commit_message>
<xml_diff>
--- a/Networking_Last_Project.docx
+++ b/Networking_Last_Project.docx
@@ -515,7 +515,12 @@
         </w:p>
       </w:sdtContent>
     </w:sdt>
-    <w:p/>
+    <w:p>
+      <w:r>
+        <w:lastRenderedPageBreak/>
+        <w:t xml:space="preserve"> </w:t>
+      </w:r>
+    </w:p>
     <w:sdt>
       <w:sdtPr>
         <w:rPr>
@@ -577,10 +582,11 @@
           <w:r>
             <w:fldChar w:fldCharType="separate"/>
           </w:r>
-          <w:hyperlink w:anchor="_Toc229418982" w:history="1">
+          <w:hyperlink w:anchor="_Toc229425896" w:history="1">
             <w:r>
               <w:rPr>
                 <w:rStyle w:val="Hyperlink"/>
+                <w:rFonts w:ascii="Amasis MT Pro Medium" w:hAnsi="Amasis MT Pro Medium"/>
                 <w:noProof/>
               </w:rPr>
               <w:t>Actual Situation</w:t>
@@ -604,7 +610,7 @@
                 <w:noProof/>
                 <w:webHidden/>
               </w:rPr>
-              <w:instrText xml:space="preserve"> PAGEREF _Toc229418982 \h </w:instrText>
+              <w:instrText xml:space="preserve"> PAGEREF _Toc229425896 \h </w:instrText>
             </w:r>
             <w:r>
               <w:rPr>
@@ -624,7 +630,217 @@
                 <w:noProof/>
                 <w:webHidden/>
               </w:rPr>
-              <w:t>3</w:t>
+              <w:t>2</w:t>
+            </w:r>
+            <w:r>
+              <w:rPr>
+                <w:noProof/>
+                <w:webHidden/>
+              </w:rPr>
+              <w:fldChar w:fldCharType="end"/>
+            </w:r>
+          </w:hyperlink>
+        </w:p>
+        <w:p>
+          <w:pPr>
+            <w:pStyle w:val="TOC2"/>
+            <w:tabs>
+              <w:tab w:val="right" w:leader="dot" w:pos="9350"/>
+            </w:tabs>
+            <w:rPr>
+              <w:rFonts w:eastAsiaTheme="minorEastAsia"/>
+              <w:noProof/>
+              <w:lang w:eastAsia="en-CA"/>
+            </w:rPr>
+          </w:pPr>
+          <w:hyperlink w:anchor="_Toc229425897" w:history="1">
+            <w:r>
+              <w:rPr>
+                <w:rStyle w:val="Hyperlink"/>
+                <w:noProof/>
+              </w:rPr>
+              <w:t>Intro</w:t>
+            </w:r>
+            <w:r>
+              <w:rPr>
+                <w:noProof/>
+                <w:webHidden/>
+              </w:rPr>
+              <w:tab/>
+            </w:r>
+            <w:r>
+              <w:rPr>
+                <w:noProof/>
+                <w:webHidden/>
+              </w:rPr>
+              <w:fldChar w:fldCharType="begin"/>
+            </w:r>
+            <w:r>
+              <w:rPr>
+                <w:noProof/>
+                <w:webHidden/>
+              </w:rPr>
+              <w:instrText xml:space="preserve"> PAGEREF _Toc229425897 \h </w:instrText>
+            </w:r>
+            <w:r>
+              <w:rPr>
+                <w:noProof/>
+                <w:webHidden/>
+              </w:rPr>
+            </w:r>
+            <w:r>
+              <w:rPr>
+                <w:noProof/>
+                <w:webHidden/>
+              </w:rPr>
+              <w:fldChar w:fldCharType="separate"/>
+            </w:r>
+            <w:r>
+              <w:rPr>
+                <w:noProof/>
+                <w:webHidden/>
+              </w:rPr>
+              <w:t>2</w:t>
+            </w:r>
+            <w:r>
+              <w:rPr>
+                <w:noProof/>
+                <w:webHidden/>
+              </w:rPr>
+              <w:fldChar w:fldCharType="end"/>
+            </w:r>
+          </w:hyperlink>
+        </w:p>
+        <w:p>
+          <w:pPr>
+            <w:pStyle w:val="TOC2"/>
+            <w:tabs>
+              <w:tab w:val="right" w:leader="dot" w:pos="9350"/>
+            </w:tabs>
+            <w:rPr>
+              <w:rFonts w:eastAsiaTheme="minorEastAsia"/>
+              <w:noProof/>
+              <w:lang w:eastAsia="en-CA"/>
+            </w:rPr>
+          </w:pPr>
+          <w:hyperlink w:anchor="_Toc229425898" w:history="1">
+            <w:r>
+              <w:rPr>
+                <w:rStyle w:val="Hyperlink"/>
+                <w:noProof/>
+              </w:rPr>
+              <w:t>Inventory</w:t>
+            </w:r>
+            <w:r>
+              <w:rPr>
+                <w:noProof/>
+                <w:webHidden/>
+              </w:rPr>
+              <w:tab/>
+            </w:r>
+            <w:r>
+              <w:rPr>
+                <w:noProof/>
+                <w:webHidden/>
+              </w:rPr>
+              <w:fldChar w:fldCharType="begin"/>
+            </w:r>
+            <w:r>
+              <w:rPr>
+                <w:noProof/>
+                <w:webHidden/>
+              </w:rPr>
+              <w:instrText xml:space="preserve"> PAGEREF _Toc229425898 \h </w:instrText>
+            </w:r>
+            <w:r>
+              <w:rPr>
+                <w:noProof/>
+                <w:webHidden/>
+              </w:rPr>
+            </w:r>
+            <w:r>
+              <w:rPr>
+                <w:noProof/>
+                <w:webHidden/>
+              </w:rPr>
+              <w:fldChar w:fldCharType="separate"/>
+            </w:r>
+            <w:r>
+              <w:rPr>
+                <w:noProof/>
+                <w:webHidden/>
+              </w:rPr>
+              <w:t>2</w:t>
+            </w:r>
+            <w:r>
+              <w:rPr>
+                <w:noProof/>
+                <w:webHidden/>
+              </w:rPr>
+              <w:fldChar w:fldCharType="end"/>
+            </w:r>
+          </w:hyperlink>
+        </w:p>
+        <w:p>
+          <w:pPr>
+            <w:pStyle w:val="TOC2"/>
+            <w:tabs>
+              <w:tab w:val="right" w:leader="dot" w:pos="9350"/>
+            </w:tabs>
+            <w:rPr>
+              <w:rFonts w:eastAsiaTheme="minorEastAsia"/>
+              <w:noProof/>
+              <w:lang w:eastAsia="en-CA"/>
+            </w:rPr>
+          </w:pPr>
+          <w:hyperlink w:anchor="_Toc229425899" w:history="1">
+            <w:r>
+              <w:rPr>
+                <w:rStyle w:val="Hyperlink"/>
+                <w:noProof/>
+              </w:rPr>
+              <w:t>Limitations</w:t>
+            </w:r>
+            <w:r>
+              <w:rPr>
+                <w:noProof/>
+                <w:webHidden/>
+              </w:rPr>
+              <w:tab/>
+            </w:r>
+            <w:r>
+              <w:rPr>
+                <w:noProof/>
+                <w:webHidden/>
+              </w:rPr>
+              <w:fldChar w:fldCharType="begin"/>
+            </w:r>
+            <w:r>
+              <w:rPr>
+                <w:noProof/>
+                <w:webHidden/>
+              </w:rPr>
+              <w:instrText xml:space="preserve"> PAGEREF _Toc229425899 \h </w:instrText>
+            </w:r>
+            <w:r>
+              <w:rPr>
+                <w:noProof/>
+                <w:webHidden/>
+              </w:rPr>
+            </w:r>
+            <w:r>
+              <w:rPr>
+                <w:noProof/>
+                <w:webHidden/>
+              </w:rPr>
+              <w:fldChar w:fldCharType="separate"/>
+            </w:r>
+            <w:r>
+              <w:rPr>
+                <w:noProof/>
+                <w:webHidden/>
+              </w:rPr>
+              <w:t>2</w:t>
             </w:r>
             <w:r>
               <w:rPr>
@@ -647,10 +863,11 @@
               <w:lang w:eastAsia="en-CA"/>
             </w:rPr>
           </w:pPr>
-          <w:hyperlink w:anchor="_Toc229418983" w:history="1">
+          <w:hyperlink w:anchor="_Toc229425900" w:history="1">
             <w:r>
               <w:rPr>
                 <w:rStyle w:val="Hyperlink"/>
+                <w:rFonts w:ascii="Amasis MT Pro Medium" w:hAnsi="Amasis MT Pro Medium"/>
                 <w:noProof/>
               </w:rPr>
               <w:t>Solution/Recommendation</w:t>
@@ -674,7 +891,147 @@
                 <w:noProof/>
                 <w:webHidden/>
               </w:rPr>
-              <w:instrText xml:space="preserve"> PAGEREF _Toc229418983 \h </w:instrText>
+              <w:instrText xml:space="preserve"> PAGEREF _Toc229425900 \h </w:instrText>
+            </w:r>
+            <w:r>
+              <w:rPr>
+                <w:noProof/>
+                <w:webHidden/>
+              </w:rPr>
+            </w:r>
+            <w:r>
+              <w:rPr>
+                <w:noProof/>
+                <w:webHidden/>
+              </w:rPr>
+              <w:fldChar w:fldCharType="separate"/>
+            </w:r>
+            <w:r>
+              <w:rPr>
+                <w:noProof/>
+                <w:webHidden/>
+              </w:rPr>
+              <w:t>4</w:t>
+            </w:r>
+            <w:r>
+              <w:rPr>
+                <w:noProof/>
+                <w:webHidden/>
+              </w:rPr>
+              <w:fldChar w:fldCharType="end"/>
+            </w:r>
+          </w:hyperlink>
+        </w:p>
+        <w:p>
+          <w:pPr>
+            <w:pStyle w:val="TOC2"/>
+            <w:tabs>
+              <w:tab w:val="right" w:leader="dot" w:pos="9350"/>
+            </w:tabs>
+            <w:rPr>
+              <w:rFonts w:eastAsiaTheme="minorEastAsia"/>
+              <w:noProof/>
+              <w:lang w:eastAsia="en-CA"/>
+            </w:rPr>
+          </w:pPr>
+          <w:hyperlink w:anchor="_Toc229425901" w:history="1">
+            <w:r>
+              <w:rPr>
+                <w:rStyle w:val="Hyperlink"/>
+                <w:noProof/>
+              </w:rPr>
+              <w:t>Cabling Infrastructure</w:t>
+            </w:r>
+            <w:r>
+              <w:rPr>
+                <w:noProof/>
+                <w:webHidden/>
+              </w:rPr>
+              <w:tab/>
+            </w:r>
+            <w:r>
+              <w:rPr>
+                <w:noProof/>
+                <w:webHidden/>
+              </w:rPr>
+              <w:fldChar w:fldCharType="begin"/>
+            </w:r>
+            <w:r>
+              <w:rPr>
+                <w:noProof/>
+                <w:webHidden/>
+              </w:rPr>
+              <w:instrText xml:space="preserve"> PAGEREF _Toc229425901 \h </w:instrText>
+            </w:r>
+            <w:r>
+              <w:rPr>
+                <w:noProof/>
+                <w:webHidden/>
+              </w:rPr>
+            </w:r>
+            <w:r>
+              <w:rPr>
+                <w:noProof/>
+                <w:webHidden/>
+              </w:rPr>
+              <w:fldChar w:fldCharType="separate"/>
+            </w:r>
+            <w:r>
+              <w:rPr>
+                <w:noProof/>
+                <w:webHidden/>
+              </w:rPr>
+              <w:t>4</w:t>
+            </w:r>
+            <w:r>
+              <w:rPr>
+                <w:noProof/>
+                <w:webHidden/>
+              </w:rPr>
+              <w:fldChar w:fldCharType="end"/>
+            </w:r>
+          </w:hyperlink>
+        </w:p>
+        <w:p>
+          <w:pPr>
+            <w:pStyle w:val="TOC2"/>
+            <w:tabs>
+              <w:tab w:val="right" w:leader="dot" w:pos="9350"/>
+            </w:tabs>
+            <w:rPr>
+              <w:rFonts w:eastAsiaTheme="minorEastAsia"/>
+              <w:noProof/>
+              <w:lang w:eastAsia="en-CA"/>
+            </w:rPr>
+          </w:pPr>
+          <w:hyperlink w:anchor="_Toc229425902" w:history="1">
+            <w:r>
+              <w:rPr>
+                <w:rStyle w:val="Hyperlink"/>
+                <w:noProof/>
+              </w:rPr>
+              <w:t>Addressing Scheme</w:t>
+            </w:r>
+            <w:r>
+              <w:rPr>
+                <w:noProof/>
+                <w:webHidden/>
+              </w:rPr>
+              <w:tab/>
+            </w:r>
+            <w:r>
+              <w:rPr>
+                <w:noProof/>
+                <w:webHidden/>
+              </w:rPr>
+              <w:fldChar w:fldCharType="begin"/>
+            </w:r>
+            <w:r>
+              <w:rPr>
+                <w:noProof/>
+                <w:webHidden/>
+              </w:rPr>
+              <w:instrText xml:space="preserve"> PAGEREF _Toc229425902 \h </w:instrText>
             </w:r>
             <w:r>
               <w:rPr>
@@ -717,7 +1074,7 @@
               <w:lang w:eastAsia="en-CA"/>
             </w:rPr>
           </w:pPr>
-          <w:hyperlink w:anchor="_Toc229418984" w:history="1">
+          <w:hyperlink w:anchor="_Toc229425903" w:history="1">
             <w:r>
               <w:rPr>
                 <w:rStyle w:val="Hyperlink"/>
@@ -745,7 +1102,7 @@
                 <w:noProof/>
                 <w:webHidden/>
               </w:rPr>
-              <w:instrText xml:space="preserve"> PAGEREF _Toc229418984 \h </w:instrText>
+              <w:instrText xml:space="preserve"> PAGEREF _Toc229425903 \h </w:instrText>
             </w:r>
             <w:r>
               <w:rPr>
@@ -788,7 +1145,7 @@
               <w:lang w:eastAsia="en-CA"/>
             </w:rPr>
           </w:pPr>
-          <w:hyperlink w:anchor="_Toc229418985" w:history="1">
+          <w:hyperlink w:anchor="_Toc229425904" w:history="1">
             <w:r>
               <w:rPr>
                 <w:rStyle w:val="Hyperlink"/>
@@ -816,7 +1173,7 @@
                 <w:noProof/>
                 <w:webHidden/>
               </w:rPr>
-              <w:instrText xml:space="preserve"> PAGEREF _Toc229418985 \h </w:instrText>
+              <w:instrText xml:space="preserve"> PAGEREF _Toc229425904 \h </w:instrText>
             </w:r>
             <w:r>
               <w:rPr>
@@ -837,6 +1194,243 @@
                 <w:webHidden/>
               </w:rPr>
               <w:t>6</w:t>
+            </w:r>
+            <w:r>
+              <w:rPr>
+                <w:noProof/>
+                <w:webHidden/>
+              </w:rPr>
+              <w:fldChar w:fldCharType="end"/>
+            </w:r>
+          </w:hyperlink>
+        </w:p>
+        <w:p>
+          <w:pPr>
+            <w:pStyle w:val="TOC2"/>
+            <w:tabs>
+              <w:tab w:val="right" w:leader="dot" w:pos="9350"/>
+            </w:tabs>
+            <w:rPr>
+              <w:rFonts w:eastAsiaTheme="minorEastAsia"/>
+              <w:noProof/>
+              <w:lang w:eastAsia="en-CA"/>
+            </w:rPr>
+          </w:pPr>
+          <w:hyperlink w:anchor="_Toc229425905" w:history="1">
+            <w:r>
+              <w:rPr>
+                <w:rStyle w:val="Hyperlink"/>
+                <w:b/>
+                <w:bCs/>
+                <w:noProof/>
+              </w:rPr>
+              <w:t>Appendix A:</w:t>
+            </w:r>
+            <w:r>
+              <w:rPr>
+                <w:rStyle w:val="Hyperlink"/>
+                <w:noProof/>
+              </w:rPr>
+              <w:t xml:space="preserve"> Terms and Definitions</w:t>
+            </w:r>
+            <w:r>
+              <w:rPr>
+                <w:noProof/>
+                <w:webHidden/>
+              </w:rPr>
+              <w:tab/>
+            </w:r>
+            <w:r>
+              <w:rPr>
+                <w:noProof/>
+                <w:webHidden/>
+              </w:rPr>
+              <w:fldChar w:fldCharType="begin"/>
+            </w:r>
+            <w:r>
+              <w:rPr>
+                <w:noProof/>
+                <w:webHidden/>
+              </w:rPr>
+              <w:instrText xml:space="preserve"> PAGEREF _Toc229425905 \h </w:instrText>
+            </w:r>
+            <w:r>
+              <w:rPr>
+                <w:noProof/>
+                <w:webHidden/>
+              </w:rPr>
+            </w:r>
+            <w:r>
+              <w:rPr>
+                <w:noProof/>
+                <w:webHidden/>
+              </w:rPr>
+              <w:fldChar w:fldCharType="separate"/>
+            </w:r>
+            <w:r>
+              <w:rPr>
+                <w:noProof/>
+                <w:webHidden/>
+              </w:rPr>
+              <w:t>6</w:t>
+            </w:r>
+            <w:r>
+              <w:rPr>
+                <w:noProof/>
+                <w:webHidden/>
+              </w:rPr>
+              <w:fldChar w:fldCharType="end"/>
+            </w:r>
+          </w:hyperlink>
+        </w:p>
+        <w:p>
+          <w:pPr>
+            <w:pStyle w:val="TOC2"/>
+            <w:tabs>
+              <w:tab w:val="right" w:leader="dot" w:pos="9350"/>
+            </w:tabs>
+            <w:rPr>
+              <w:rFonts w:eastAsiaTheme="minorEastAsia"/>
+              <w:noProof/>
+              <w:lang w:eastAsia="en-CA"/>
+            </w:rPr>
+          </w:pPr>
+          <w:hyperlink w:anchor="_Toc229425906" w:history="1">
+            <w:r>
+              <w:rPr>
+                <w:rStyle w:val="Hyperlink"/>
+                <w:b/>
+                <w:bCs/>
+                <w:noProof/>
+              </w:rPr>
+              <w:t>Appendix B:</w:t>
+            </w:r>
+            <w:r>
+              <w:rPr>
+                <w:rStyle w:val="Hyperlink"/>
+                <w:noProof/>
+              </w:rPr>
+              <w:t xml:space="preserve"> Network Diagrams</w:t>
+            </w:r>
+            <w:r>
+              <w:rPr>
+                <w:noProof/>
+                <w:webHidden/>
+              </w:rPr>
+              <w:tab/>
+            </w:r>
+            <w:r>
+              <w:rPr>
+                <w:noProof/>
+                <w:webHidden/>
+              </w:rPr>
+              <w:fldChar w:fldCharType="begin"/>
+            </w:r>
+            <w:r>
+              <w:rPr>
+                <w:noProof/>
+                <w:webHidden/>
+              </w:rPr>
+              <w:instrText xml:space="preserve"> PAGEREF _Toc229425906 \h </w:instrText>
+            </w:r>
+            <w:r>
+              <w:rPr>
+                <w:noProof/>
+                <w:webHidden/>
+              </w:rPr>
+            </w:r>
+            <w:r>
+              <w:rPr>
+                <w:noProof/>
+                <w:webHidden/>
+              </w:rPr>
+              <w:fldChar w:fldCharType="separate"/>
+            </w:r>
+            <w:r>
+              <w:rPr>
+                <w:noProof/>
+                <w:webHidden/>
+              </w:rPr>
+              <w:t>7</w:t>
+            </w:r>
+            <w:r>
+              <w:rPr>
+                <w:noProof/>
+                <w:webHidden/>
+              </w:rPr>
+              <w:fldChar w:fldCharType="end"/>
+            </w:r>
+          </w:hyperlink>
+        </w:p>
+        <w:p>
+          <w:pPr>
+            <w:pStyle w:val="TOC2"/>
+            <w:tabs>
+              <w:tab w:val="right" w:leader="dot" w:pos="9350"/>
+            </w:tabs>
+            <w:rPr>
+              <w:rFonts w:eastAsiaTheme="minorEastAsia"/>
+              <w:noProof/>
+              <w:lang w:eastAsia="en-CA"/>
+            </w:rPr>
+          </w:pPr>
+          <w:hyperlink w:anchor="_Toc229425907" w:history="1">
+            <w:r>
+              <w:rPr>
+                <w:rStyle w:val="Hyperlink"/>
+                <w:b/>
+                <w:bCs/>
+                <w:noProof/>
+              </w:rPr>
+              <w:t>Appendix C:</w:t>
+            </w:r>
+            <w:r>
+              <w:rPr>
+                <w:rStyle w:val="Hyperlink"/>
+                <w:noProof/>
+              </w:rPr>
+              <w:t xml:space="preserve"> Inventory List</w:t>
+            </w:r>
+            <w:r>
+              <w:rPr>
+                <w:noProof/>
+                <w:webHidden/>
+              </w:rPr>
+              <w:tab/>
+            </w:r>
+            <w:r>
+              <w:rPr>
+                <w:noProof/>
+                <w:webHidden/>
+              </w:rPr>
+              <w:fldChar w:fldCharType="begin"/>
+            </w:r>
+            <w:r>
+              <w:rPr>
+                <w:noProof/>
+                <w:webHidden/>
+              </w:rPr>
+              <w:instrText xml:space="preserve"> PAGEREF _Toc229425907 \h </w:instrText>
+            </w:r>
+            <w:r>
+              <w:rPr>
+                <w:noProof/>
+                <w:webHidden/>
+              </w:rPr>
+            </w:r>
+            <w:r>
+              <w:rPr>
+                <w:noProof/>
+                <w:webHidden/>
+              </w:rPr>
+              <w:fldChar w:fldCharType="separate"/>
+            </w:r>
+            <w:r>
+              <w:rPr>
+                <w:noProof/>
+                <w:webHidden/>
+              </w:rPr>
+              <w:t>8</w:t>
             </w:r>
             <w:r>
               <w:rPr>
@@ -874,7 +1468,7 @@
           <w:szCs w:val="56"/>
         </w:rPr>
       </w:pPr>
-      <w:bookmarkStart w:id="0" w:name="_Toc229418982"/>
+      <w:bookmarkStart w:id="0" w:name="_Toc229425896"/>
       <w:r>
         <w:rPr>
           <w:rFonts w:ascii="Amasis MT Pro Medium" w:hAnsi="Amasis MT Pro Medium"/>
@@ -888,13 +1482,47 @@
     </w:p>
     <w:p>
       <w:pPr>
+        <w:pStyle w:val="Heading2"/>
+      </w:pPr>
+      <w:bookmarkStart w:id="1" w:name="_Toc229425897"/>
+      <w:r>
+        <w:t>Intro</w:t>
+      </w:r>
+      <w:bookmarkEnd w:id="1"/>
+    </w:p>
+    <w:p>
+      <w:pPr>
         <w:ind w:firstLine="360"/>
       </w:pPr>
       <w:r>
         <w:t>Through conducting an interview with</w:t>
       </w:r>
       <w:r>
-        <w:t xml:space="preserve"> Health Life Specialists, we were able to determine that the hospital’s original site’s topology consisted of a mesh design due to </w:t>
+        <w:t xml:space="preserve"> Health Life Specialists, </w:t>
+      </w:r>
+      <w:r>
+        <w:t xml:space="preserve">it was </w:t>
+      </w:r>
+      <w:r>
+        <w:t>determine</w:t>
+      </w:r>
+      <w:r>
+        <w:t xml:space="preserve">d </w:t>
+      </w:r>
+      <w:r>
+        <w:t xml:space="preserve">that the hospital’s original site’s </w:t>
+      </w:r>
+      <w:r>
+        <w:t xml:space="preserve">network infrastructure </w:t>
+      </w:r>
+      <w:r>
+        <w:t xml:space="preserve">consisted of a mesh </w:t>
+      </w:r>
+      <w:r>
+        <w:t xml:space="preserve">topology </w:t>
+      </w:r>
+      <w:r>
+        <w:t xml:space="preserve">design due to </w:t>
       </w:r>
       <w:r>
         <w:t xml:space="preserve">the </w:t>
@@ -906,7 +1534,40 @@
         <w:t>connections</w:t>
       </w:r>
       <w:r>
-        <w:t xml:space="preserve"> between the routers and servers. The hospital’s main site’s inventory consisted of:</w:t>
+        <w:t xml:space="preserve"> between the routers and servers. </w:t>
+      </w:r>
+      <w:r>
+        <w:t xml:space="preserve">The network contains multiple direct connections between routers, switches, and the server </w:t>
+      </w:r>
+      <w:r>
+        <w:t>to</w:t>
+      </w:r>
+      <w:r>
+        <w:t xml:space="preserve"> provide redundancy and maintain communication between departments and services.</w:t>
+      </w:r>
+      <w:r>
+        <w:t xml:space="preserve"> T</w:t>
+      </w:r>
+      <w:r>
+        <w:t>he clients plan to expand the medical facility by opening a second location approximately 12 km away from the main site.</w:t>
+      </w:r>
+    </w:p>
+    <w:p>
+      <w:pPr>
+        <w:pStyle w:val="Heading2"/>
+      </w:pPr>
+      <w:bookmarkStart w:id="2" w:name="_Toc229425898"/>
+      <w:r>
+        <w:t>Inventory</w:t>
+      </w:r>
+      <w:bookmarkEnd w:id="2"/>
+    </w:p>
+    <w:p>
+      <w:pPr>
+        <w:ind w:firstLine="360"/>
+      </w:pPr>
+      <w:r>
+        <w:t>The hospital’s main site’s inventory consisted of:</w:t>
       </w:r>
     </w:p>
     <w:p>
@@ -1054,6 +1715,47 @@
       </w:r>
       <w:r>
         <w:t xml:space="preserve"> </w:t>
+      </w:r>
+    </w:p>
+    <w:p>
+      <w:pPr>
+        <w:pStyle w:val="Heading2"/>
+      </w:pPr>
+      <w:bookmarkStart w:id="3" w:name="_Toc229425899"/>
+      <w:r>
+        <w:t>Limitations</w:t>
+      </w:r>
+      <w:bookmarkEnd w:id="3"/>
+    </w:p>
+    <w:p>
+      <w:pPr>
+        <w:ind w:firstLine="360"/>
+      </w:pPr>
+      <w:r>
+        <w:t>During the interview, several limitations in the network were identified Staff at the new location will require constant access to the Patient Management System (PMS), imaging databases, and lab result portals hosted at the main site. Due to the hospital’s use of high-resolution medical imaging files, the current network experiences a lag during large file transmissions, and the storage capacity is becoming insufficient.</w:t>
+      </w:r>
+    </w:p>
+    <w:p>
+      <w:pPr>
+        <w:ind w:firstLine="360"/>
+      </w:pPr>
+      <w:r>
+        <w:t>The client also indicated that all data and services must remain on-site due to strict medical privacy regulations and the large size of imaging files. Cloud-based solutions were rejected in favor of locally managed infrastructure. In addition, the clients have requested for the hospital t</w:t>
+      </w:r>
+      <w:r>
+        <w:t xml:space="preserve">o have a secure wireless access for staff tablets, a sperate guest Wi-Fi </w:t>
+      </w:r>
+      <w:r>
+        <w:lastRenderedPageBreak/>
+        <w:t>network for patients, and VPN connectivity to support doctors working remotely on a hybrid schedule.</w:t>
+      </w:r>
+    </w:p>
+    <w:p>
+      <w:pPr>
+        <w:ind w:firstLine="360"/>
+      </w:pPr>
+      <w:r>
+        <w:t>The expansion will also increase the number of employees by approximately 50%, creating a need for additional devices, improved bandwidth for data, secure inter-site communication, and scalable network segmentation using VLANS and VLSM.</w:t>
       </w:r>
     </w:p>
     <w:p/>
@@ -1067,7 +1769,6 @@
           <w:szCs w:val="40"/>
         </w:rPr>
       </w:pPr>
-      <w:bookmarkStart w:id="1" w:name="_Toc229418983"/>
       <w:r>
         <w:br w:type="page"/>
       </w:r>
@@ -1076,14 +1777,420 @@
       <w:pPr>
         <w:pStyle w:val="Heading1"/>
         <w:jc w:val="center"/>
-      </w:pPr>
-      <w:r>
+        <w:rPr>
+          <w:rFonts w:ascii="Amasis MT Pro Medium" w:hAnsi="Amasis MT Pro Medium"/>
+          <w:sz w:val="56"/>
+          <w:szCs w:val="56"/>
+        </w:rPr>
+      </w:pPr>
+      <w:bookmarkStart w:id="4" w:name="_Toc229425900"/>
+      <w:r>
+        <w:rPr>
+          <w:rFonts w:ascii="Amasis MT Pro Medium" w:hAnsi="Amasis MT Pro Medium"/>
+          <w:sz w:val="56"/>
+          <w:szCs w:val="56"/>
+        </w:rPr>
         <w:lastRenderedPageBreak/>
         <w:t>Solution/Recommendation</w:t>
       </w:r>
-      <w:bookmarkEnd w:id="1"/>
-    </w:p>
-    <w:p/>
+      <w:bookmarkEnd w:id="4"/>
+    </w:p>
+    <w:p>
+      <w:r>
+        <w:t xml:space="preserve">The </w:t>
+      </w:r>
+      <w:r>
+        <w:t>proposed solution focuses on improving the hospital’s network performance, scalability, storage capacity, wireless connectivity, and security while ensuring compliance with medical privacy requirements. The upgraded network infrastructure will support the expansion to the new location while maintaining a stable and secure communication between both sites.</w:t>
+      </w:r>
+    </w:p>
+    <w:p>
+      <w:pPr>
+        <w:pStyle w:val="Heading2"/>
+      </w:pPr>
+      <w:bookmarkStart w:id="5" w:name="_Toc229425901"/>
+      <w:r>
+        <w:t>Cabling Infrastructure</w:t>
+      </w:r>
+      <w:bookmarkEnd w:id="5"/>
+    </w:p>
+    <w:p>
+      <w:r>
+        <w:t>With the new location being approximately 12 km away from the main hospital site, fiber optic cabling will be implemented as the primary connection between both facilities. Fiver optic cables are more reliable over long distances than copper cabling and provide faster transmission speeds, lower latency, and improved security</w:t>
+      </w:r>
+      <w:r>
+        <w:t>. This is essential for transmitting large medical imaging files and patient records between locations.</w:t>
+      </w:r>
+    </w:p>
+    <w:p>
+      <w:r>
+        <w:t>In addition, the existing cabling of the hospital’s topology will be upgraded to Shielded Twisted Pair (STP) CAT 6 cabling or higher, as CAT 6 STP supports transmission speeds up to 10Gbps, which will significantly reduce lag during large file transfers and improve communication between departments. The hospitals contain many electronic medical devices such as MRI machines, x-ray systems, and patient monitors which generate electro magnetic interferences (EMI). STP cabling will prevent the interferences and improve the overall network reliability.</w:t>
+      </w:r>
+    </w:p>
+    <w:p>
+      <w:pPr>
+        <w:pStyle w:val="Heading2"/>
+      </w:pPr>
+      <w:bookmarkStart w:id="6" w:name="_Toc229425902"/>
+      <w:r>
+        <w:t>Addressing Scheme</w:t>
+      </w:r>
+      <w:bookmarkEnd w:id="6"/>
+    </w:p>
+    <w:tbl>
+      <w:tblPr>
+        <w:tblStyle w:val="TableGrid"/>
+        <w:tblW w:w="0" w:type="auto"/>
+        <w:tblLook w:val="04A0" w:firstRow="1" w:lastRow="0" w:firstColumn="1" w:lastColumn="0" w:noHBand="0" w:noVBand="1"/>
+      </w:tblPr>
+      <w:tblGrid>
+        <w:gridCol w:w="2337"/>
+        <w:gridCol w:w="2337"/>
+        <w:gridCol w:w="2338"/>
+        <w:gridCol w:w="2338"/>
+      </w:tblGrid>
+      <w:tr>
+        <w:tc>
+          <w:tcPr>
+            <w:tcW w:w="2337" w:type="dxa"/>
+          </w:tcPr>
+          <w:p>
+            <w:r>
+              <w:t>IP-Phones</w:t>
+            </w:r>
+          </w:p>
+        </w:tc>
+        <w:tc>
+          <w:tcPr>
+            <w:tcW w:w="2337" w:type="dxa"/>
+          </w:tcPr>
+          <w:p>
+            <w:r>
+              <w:t>VLAN 1</w:t>
+            </w:r>
+          </w:p>
+        </w:tc>
+        <w:tc>
+          <w:tcPr>
+            <w:tcW w:w="2338" w:type="dxa"/>
+          </w:tcPr>
+          <w:p>
+            <w:r>
+              <w:t>192.168.0.32</w:t>
+            </w:r>
+          </w:p>
+        </w:tc>
+        <w:tc>
+          <w:tcPr>
+            <w:tcW w:w="2338" w:type="dxa"/>
+          </w:tcPr>
+          <w:p/>
+        </w:tc>
+      </w:tr>
+      <w:tr>
+        <w:tc>
+          <w:tcPr>
+            <w:tcW w:w="2337" w:type="dxa"/>
+          </w:tcPr>
+          <w:p>
+            <w:r>
+              <w:t>Doctors</w:t>
+            </w:r>
+          </w:p>
+        </w:tc>
+        <w:tc>
+          <w:tcPr>
+            <w:tcW w:w="2337" w:type="dxa"/>
+          </w:tcPr>
+          <w:p>
+            <w:r>
+              <w:t>VLAN 10</w:t>
+            </w:r>
+          </w:p>
+        </w:tc>
+        <w:tc>
+          <w:tcPr>
+            <w:tcW w:w="2338" w:type="dxa"/>
+          </w:tcPr>
+          <w:p>
+            <w:r>
+              <w:t>192.168.0.128</w:t>
+            </w:r>
+          </w:p>
+        </w:tc>
+        <w:tc>
+          <w:tcPr>
+            <w:tcW w:w="2338" w:type="dxa"/>
+          </w:tcPr>
+          <w:p/>
+        </w:tc>
+      </w:tr>
+      <w:tr>
+        <w:tc>
+          <w:tcPr>
+            <w:tcW w:w="2337" w:type="dxa"/>
+          </w:tcPr>
+          <w:p>
+            <w:r>
+              <w:t>Nurses</w:t>
+            </w:r>
+          </w:p>
+        </w:tc>
+        <w:tc>
+          <w:tcPr>
+            <w:tcW w:w="2337" w:type="dxa"/>
+          </w:tcPr>
+          <w:p>
+            <w:r>
+              <w:t>VLAN 20</w:t>
+            </w:r>
+          </w:p>
+        </w:tc>
+        <w:tc>
+          <w:tcPr>
+            <w:tcW w:w="2338" w:type="dxa"/>
+          </w:tcPr>
+          <w:p>
+            <w:r>
+              <w:t>192.168.0.96</w:t>
+            </w:r>
+          </w:p>
+        </w:tc>
+        <w:tc>
+          <w:tcPr>
+            <w:tcW w:w="2338" w:type="dxa"/>
+          </w:tcPr>
+          <w:p/>
+        </w:tc>
+      </w:tr>
+      <w:tr>
+        <w:tc>
+          <w:tcPr>
+            <w:tcW w:w="2337" w:type="dxa"/>
+          </w:tcPr>
+          <w:p>
+            <w:r>
+              <w:t>Admins/Reception</w:t>
+            </w:r>
+          </w:p>
+        </w:tc>
+        <w:tc>
+          <w:tcPr>
+            <w:tcW w:w="2337" w:type="dxa"/>
+          </w:tcPr>
+          <w:p>
+            <w:r>
+              <w:t>VLAN 30</w:t>
+            </w:r>
+          </w:p>
+        </w:tc>
+        <w:tc>
+          <w:tcPr>
+            <w:tcW w:w="2338" w:type="dxa"/>
+          </w:tcPr>
+          <w:p>
+            <w:r>
+              <w:t>192.168.0.144</w:t>
+            </w:r>
+          </w:p>
+        </w:tc>
+        <w:tc>
+          <w:tcPr>
+            <w:tcW w:w="2338" w:type="dxa"/>
+          </w:tcPr>
+          <w:p/>
+        </w:tc>
+      </w:tr>
+      <w:tr>
+        <w:tc>
+          <w:tcPr>
+            <w:tcW w:w="2337" w:type="dxa"/>
+          </w:tcPr>
+          <w:p>
+            <w:r>
+              <w:t>Servers</w:t>
+            </w:r>
+          </w:p>
+        </w:tc>
+        <w:tc>
+          <w:tcPr>
+            <w:tcW w:w="2337" w:type="dxa"/>
+          </w:tcPr>
+          <w:p>
+            <w:r>
+              <w:t>VLAN 40</w:t>
+            </w:r>
+          </w:p>
+        </w:tc>
+        <w:tc>
+          <w:tcPr>
+            <w:tcW w:w="2338" w:type="dxa"/>
+          </w:tcPr>
+          <w:p>
+            <w:r>
+              <w:t>192.168.0.152</w:t>
+            </w:r>
+          </w:p>
+        </w:tc>
+        <w:tc>
+          <w:tcPr>
+            <w:tcW w:w="2338" w:type="dxa"/>
+          </w:tcPr>
+          <w:p/>
+        </w:tc>
+      </w:tr>
+      <w:tr>
+        <w:tc>
+          <w:tcPr>
+            <w:tcW w:w="2337" w:type="dxa"/>
+          </w:tcPr>
+          <w:p>
+            <w:r>
+              <w:t>Lab-Techs</w:t>
+            </w:r>
+          </w:p>
+        </w:tc>
+        <w:tc>
+          <w:tcPr>
+            <w:tcW w:w="2337" w:type="dxa"/>
+          </w:tcPr>
+          <w:p>
+            <w:r>
+              <w:t>VLAN 50</w:t>
+            </w:r>
+          </w:p>
+        </w:tc>
+        <w:tc>
+          <w:tcPr>
+            <w:tcW w:w="2338" w:type="dxa"/>
+          </w:tcPr>
+          <w:p>
+            <w:r>
+              <w:t>192.168.0.64</w:t>
+            </w:r>
+          </w:p>
+        </w:tc>
+        <w:tc>
+          <w:tcPr>
+            <w:tcW w:w="2338" w:type="dxa"/>
+          </w:tcPr>
+          <w:p/>
+        </w:tc>
+      </w:tr>
+      <w:tr>
+        <w:tc>
+          <w:tcPr>
+            <w:tcW w:w="2337" w:type="dxa"/>
+          </w:tcPr>
+          <w:p>
+            <w:r>
+              <w:t>IT</w:t>
+            </w:r>
+          </w:p>
+        </w:tc>
+        <w:tc>
+          <w:tcPr>
+            <w:tcW w:w="2337" w:type="dxa"/>
+          </w:tcPr>
+          <w:p>
+            <w:r>
+              <w:t>VLAN 60</w:t>
+            </w:r>
+          </w:p>
+        </w:tc>
+        <w:tc>
+          <w:tcPr>
+            <w:tcW w:w="2338" w:type="dxa"/>
+          </w:tcPr>
+          <w:p>
+            <w:r>
+              <w:t>192.168.0.160</w:t>
+            </w:r>
+          </w:p>
+        </w:tc>
+        <w:tc>
+          <w:tcPr>
+            <w:tcW w:w="2338" w:type="dxa"/>
+          </w:tcPr>
+          <w:p/>
+        </w:tc>
+      </w:tr>
+      <w:tr>
+        <w:tc>
+          <w:tcPr>
+            <w:tcW w:w="2337" w:type="dxa"/>
+          </w:tcPr>
+          <w:p>
+            <w:r>
+              <w:t>Guests</w:t>
+            </w:r>
+          </w:p>
+        </w:tc>
+        <w:tc>
+          <w:tcPr>
+            <w:tcW w:w="2337" w:type="dxa"/>
+          </w:tcPr>
+          <w:p>
+            <w:r>
+              <w:t>VLAN 80</w:t>
+            </w:r>
+          </w:p>
+        </w:tc>
+        <w:tc>
+          <w:tcPr>
+            <w:tcW w:w="2338" w:type="dxa"/>
+          </w:tcPr>
+          <w:p>
+            <w:r>
+              <w:t>192.168.248.0</w:t>
+            </w:r>
+          </w:p>
+        </w:tc>
+        <w:tc>
+          <w:tcPr>
+            <w:tcW w:w="2338" w:type="dxa"/>
+          </w:tcPr>
+          <w:p/>
+        </w:tc>
+      </w:tr>
+      <w:tr>
+        <w:tc>
+          <w:tcPr>
+            <w:tcW w:w="2337" w:type="dxa"/>
+          </w:tcPr>
+          <w:p>
+            <w:r>
+              <w:t>Tablets</w:t>
+            </w:r>
+          </w:p>
+        </w:tc>
+        <w:tc>
+          <w:tcPr>
+            <w:tcW w:w="2337" w:type="dxa"/>
+          </w:tcPr>
+          <w:p>
+            <w:r>
+              <w:t>VLAN 100</w:t>
+            </w:r>
+          </w:p>
+        </w:tc>
+        <w:tc>
+          <w:tcPr>
+            <w:tcW w:w="2338" w:type="dxa"/>
+          </w:tcPr>
+          <w:p>
+            <w:r>
+              <w:t>192.168.0.168</w:t>
+            </w:r>
+          </w:p>
+        </w:tc>
+        <w:tc>
+          <w:tcPr>
+            <w:tcW w:w="2338" w:type="dxa"/>
+          </w:tcPr>
+          <w:p/>
+        </w:tc>
+      </w:tr>
+    </w:tbl>
     <w:p>
       <w:pPr>
         <w:rPr>
@@ -1108,7 +2215,7 @@
           <w:rFonts w:ascii="Amasis MT Pro Medium" w:hAnsi="Amasis MT Pro Medium"/>
         </w:rPr>
       </w:pPr>
-      <w:bookmarkStart w:id="2" w:name="_Toc229418984"/>
+      <w:bookmarkStart w:id="7" w:name="_Toc229425903"/>
       <w:r>
         <w:rPr>
           <w:rFonts w:ascii="Amasis MT Pro Medium" w:hAnsi="Amasis MT Pro Medium"/>
@@ -1116,7 +2223,7 @@
         <w:lastRenderedPageBreak/>
         <w:t>Conclusions</w:t>
       </w:r>
-      <w:bookmarkEnd w:id="2"/>
+      <w:bookmarkEnd w:id="7"/>
     </w:p>
     <w:p>
       <w:pPr>
@@ -1142,7 +2249,7 @@
           <w:rFonts w:ascii="Amasis MT Pro Medium" w:hAnsi="Amasis MT Pro Medium"/>
         </w:rPr>
       </w:pPr>
-      <w:bookmarkStart w:id="3" w:name="_Toc229418985"/>
+      <w:bookmarkStart w:id="8" w:name="_Toc229425904"/>
       <w:r>
         <w:rPr>
           <w:rFonts w:ascii="Amasis MT Pro Medium" w:hAnsi="Amasis MT Pro Medium"/>
@@ -1156,9 +2263,13 @@
         </w:rPr>
         <w:t>ces</w:t>
       </w:r>
-      <w:bookmarkEnd w:id="3"/>
-    </w:p>
-    <w:p>
+      <w:bookmarkEnd w:id="8"/>
+    </w:p>
+    <w:p>
+      <w:pPr>
+        <w:pStyle w:val="Heading2"/>
+      </w:pPr>
+      <w:bookmarkStart w:id="9" w:name="_Toc229425905"/>
       <w:r>
         <w:rPr>
           <w:b/>
@@ -1169,6 +2280,7 @@
       <w:r>
         <w:t xml:space="preserve"> Terms and Definitions</w:t>
       </w:r>
+      <w:bookmarkEnd w:id="9"/>
     </w:p>
     <w:p>
       <w:r>
@@ -1356,6 +2468,10 @@
       </w:r>
     </w:p>
     <w:p>
+      <w:pPr>
+        <w:pStyle w:val="Heading2"/>
+      </w:pPr>
+      <w:bookmarkStart w:id="10" w:name="_Toc229425906"/>
       <w:r>
         <w:rPr>
           <w:b/>
@@ -1367,6 +2483,7 @@
       <w:r>
         <w:t xml:space="preserve"> Network Diagrams</w:t>
       </w:r>
+      <w:bookmarkEnd w:id="10"/>
     </w:p>
     <w:p/>
     <w:p>
@@ -1395,7 +2512,7 @@
                     <pic:cNvPicPr/>
                   </pic:nvPicPr>
                   <pic:blipFill>
-                    <a:blip r:embed="rId6">
+                    <a:blip r:embed="rId8">
                       <a:extLst>
                         <a:ext uri="{28A0092B-C50C-407E-A947-70E740481C1C}">
                           <a14:useLocalDpi xmlns:a14="http://schemas.microsoft.com/office/drawing/2010/main" val="0"/>
@@ -1451,7 +2568,7 @@
                     <pic:cNvPicPr/>
                   </pic:nvPicPr>
                   <pic:blipFill>
-                    <a:blip r:embed="rId7">
+                    <a:blip r:embed="rId9">
                       <a:extLst>
                         <a:ext uri="{28A0092B-C50C-407E-A947-70E740481C1C}">
                           <a14:useLocalDpi xmlns:a14="http://schemas.microsoft.com/office/drawing/2010/main" val="0"/>
@@ -1484,8 +2601,16 @@
         </w:drawing>
       </w:r>
     </w:p>
-    <w:p/>
-    <w:p>
+    <w:p>
+      <w:pPr>
+        <w:pStyle w:val="Heading2"/>
+      </w:pPr>
+    </w:p>
+    <w:p>
+      <w:pPr>
+        <w:pStyle w:val="Heading2"/>
+      </w:pPr>
+      <w:bookmarkStart w:id="11" w:name="_Toc229425907"/>
       <w:r>
         <w:rPr>
           <w:b/>
@@ -1496,6 +2621,7 @@
       <w:r>
         <w:t xml:space="preserve"> Inventory List</w:t>
       </w:r>
+      <w:bookmarkEnd w:id="11"/>
     </w:p>
     <w:p>
       <w:r>
@@ -1528,6 +2654,7 @@
       </w:r>
     </w:p>
     <w:sectPr>
+      <w:footerReference w:type="default" r:id="rId10"/>
       <w:pgSz w:w="12240" w:h="15840"/>
       <w:pgMar w:top="1440" w:right="1440" w:bottom="1440" w:left="1440" w:header="708" w:footer="708" w:gutter="0"/>
       <w:pgBorders w:offsetFrom="page">
@@ -1543,6 +2670,78 @@
     </w:sectPr>
   </w:body>
 </w:document>
+</file>
+
+<file path=word/endnotes.xml><?xml version="1.0" encoding="utf-8"?>
+<w:endnotes xmlns:wpc="http://schemas.microsoft.com/office/word/2010/wordprocessingCanvas" xmlns:cx="http://schemas.microsoft.com/office/drawing/2014/chartex" xmlns:cx1="http://schemas.microsoft.com/office/drawing/2015/9/8/chartex" xmlns:cx2="http://schemas.microsoft.com/office/drawing/2015/10/21/chartex" xmlns:cx3="http://schemas.microsoft.com/office/drawing/2016/5/9/chartex" xmlns:cx4="http://schemas.microsoft.com/office/drawing/2016/5/10/chartex" xmlns:cx5="http://schemas.microsoft.com/office/drawing/2016/5/11/chartex" xmlns:cx6="http://schemas.microsoft.com/office/drawing/2016/5/12/chartex" xmlns:cx7="http://schemas.microsoft.com/office/drawing/2016/5/13/chartex" xmlns:cx8="http://schemas.microsoft.com/office/drawing/2016/5/14/chartex" xmlns:mc="http://schemas.openxmlformats.org/markup-compatibility/2006" xmlns:aink="http://schemas.microsoft.com/office/drawing/2016/ink" xmlns:am3d="http://schemas.microsoft.com/office/drawing/2017/model3d" xmlns:o="urn:schemas-microsoft-com:office:office" xmlns:oel="http://schemas.microsoft.com/office/2019/extlst" xmlns:r="http://schemas.openxmlformats.org/officeDocument/2006/relationships" xmlns:m="http://schemas.openxmlformats.org/officeDocument/2006/math" xmlns:v="urn:schemas-microsoft-com:vml" xmlns:wp14="http://schemas.microsoft.com/office/word/2010/wordprocessingDrawing" xmlns:wp="http://schemas.openxmlformats.org/drawingml/2006/wordprocessingDrawing" xmlns:w10="urn:schemas-microsoft-com:office:word" xmlns:w="http://schemas.openxmlformats.org/wordprocessingml/2006/main" xmlns:w14="http://schemas.microsoft.com/office/word/2010/wordml" xmlns:w15="http://schemas.microsoft.com/office/word/2012/wordml" xmlns:w16cex="http://schemas.microsoft.com/office/word/2018/wordml/cex" xmlns:w16cid="http://schemas.microsoft.com/office/word/2016/wordml/cid" xmlns:w16="http://schemas.microsoft.com/office/word/2018/wordml" xmlns:w16du="http://schemas.microsoft.com/office/word/2023/wordml/word16du" xmlns:w16sdtdh="http://schemas.microsoft.com/office/word/2020/wordml/sdtdatahash" xmlns:w16sdtfl="http://schemas.microsoft.com/office/word/2024/wordml/sdtformatlock" xmlns:w16se="http://schemas.microsoft.com/office/word/2015/wordml/symex" xmlns:wpg="http://schemas.microsoft.com/office/word/2010/wordprocessingGroup" xmlns:wpi="http://schemas.microsoft.com/office/word/2010/wordprocessingInk" xmlns:wne="http://schemas.microsoft.com/office/word/2006/wordml" xmlns:wps="http://schemas.microsoft.com/office/word/2010/wordprocessingShape" mc:Ignorable="w14 w15 w16se w16cid w16 w16cex w16sdtdh w16sdtfl w16du wp14">
+  <w:endnote w:type="separator" w:id="-1">
+    <w:p>
+      <w:pPr>
+        <w:spacing w:after="0" w:line="240" w:lineRule="auto"/>
+      </w:pPr>
+      <w:r>
+        <w:separator/>
+      </w:r>
+    </w:p>
+  </w:endnote>
+  <w:endnote w:type="continuationSeparator" w:id="0">
+    <w:p>
+      <w:pPr>
+        <w:spacing w:after="0" w:line="240" w:lineRule="auto"/>
+      </w:pPr>
+      <w:r>
+        <w:continuationSeparator/>
+      </w:r>
+    </w:p>
+  </w:endnote>
+</w:endnotes>
+</file>
+
+<file path=word/footer1.xml><?xml version="1.0" encoding="utf-8"?>
+<w:ftr xmlns:wpc="http://schemas.microsoft.com/office/word/2010/wordprocessingCanvas" xmlns:cx="http://schemas.microsoft.com/office/drawing/2014/chartex" xmlns:cx1="http://schemas.microsoft.com/office/drawing/2015/9/8/chartex" xmlns:cx2="http://schemas.microsoft.com/office/drawing/2015/10/21/chartex" xmlns:cx3="http://schemas.microsoft.com/office/drawing/2016/5/9/chartex" xmlns:cx4="http://schemas.microsoft.com/office/drawing/2016/5/10/chartex" xmlns:cx5="http://schemas.microsoft.com/office/drawing/2016/5/11/chartex" xmlns:cx6="http://schemas.microsoft.com/office/drawing/2016/5/12/chartex" xmlns:cx7="http://schemas.microsoft.com/office/drawing/2016/5/13/chartex" xmlns:cx8="http://schemas.microsoft.com/office/drawing/2016/5/14/chartex" xmlns:mc="http://schemas.openxmlformats.org/markup-compatibility/2006" xmlns:aink="http://schemas.microsoft.com/office/drawing/2016/ink" xmlns:am3d="http://schemas.microsoft.com/office/drawing/2017/model3d" xmlns:o="urn:schemas-microsoft-com:office:office" xmlns:oel="http://schemas.microsoft.com/office/2019/extlst" xmlns:r="http://schemas.openxmlformats.org/officeDocument/2006/relationships" xmlns:m="http://schemas.openxmlformats.org/officeDocument/2006/math" xmlns:v="urn:schemas-microsoft-com:vml" xmlns:wp14="http://schemas.microsoft.com/office/word/2010/wordprocessingDrawing" xmlns:wp="http://schemas.openxmlformats.org/drawingml/2006/wordprocessingDrawing" xmlns:w10="urn:schemas-microsoft-com:office:word" xmlns:w="http://schemas.openxmlformats.org/wordprocessingml/2006/main" xmlns:w14="http://schemas.microsoft.com/office/word/2010/wordml" xmlns:w15="http://schemas.microsoft.com/office/word/2012/wordml" xmlns:w16cex="http://schemas.microsoft.com/office/word/2018/wordml/cex" xmlns:w16cid="http://schemas.microsoft.com/office/word/2016/wordml/cid" xmlns:w16="http://schemas.microsoft.com/office/word/2018/wordml" xmlns:w16du="http://schemas.microsoft.com/office/word/2023/wordml/word16du" xmlns:w16sdtdh="http://schemas.microsoft.com/office/word/2020/wordml/sdtdatahash" xmlns:w16sdtfl="http://schemas.microsoft.com/office/word/2024/wordml/sdtformatlock" xmlns:w16se="http://schemas.microsoft.com/office/word/2015/wordml/symex" xmlns:wpg="http://schemas.microsoft.com/office/word/2010/wordprocessingGroup" xmlns:wpi="http://schemas.microsoft.com/office/word/2010/wordprocessingInk" xmlns:wne="http://schemas.microsoft.com/office/word/2006/wordml" xmlns:wps="http://schemas.microsoft.com/office/word/2010/wordprocessingShape" mc:Ignorable="w14 w15 w16se w16cid w16 w16cex w16sdtdh w16sdtfl w16du wp14">
+  <w:p>
+    <w:pPr>
+      <w:pStyle w:val="Footer"/>
+      <w:pBdr>
+        <w:top w:val="single" w:sz="4" w:space="1" w:color="D9D9D9" w:themeColor="background1" w:themeShade="D9"/>
+      </w:pBdr>
+      <w:rPr>
+        <w:b/>
+        <w:bCs/>
+      </w:rPr>
+    </w:pPr>
+  </w:p>
+  <w:p>
+    <w:pPr>
+      <w:pStyle w:val="Footer"/>
+    </w:pPr>
+  </w:p>
+</w:ftr>
+</file>
+
+<file path=word/footnotes.xml><?xml version="1.0" encoding="utf-8"?>
+<w:footnotes xmlns:wpc="http://schemas.microsoft.com/office/word/2010/wordprocessingCanvas" xmlns:cx="http://schemas.microsoft.com/office/drawing/2014/chartex" xmlns:cx1="http://schemas.microsoft.com/office/drawing/2015/9/8/chartex" xmlns:cx2="http://schemas.microsoft.com/office/drawing/2015/10/21/chartex" xmlns:cx3="http://schemas.microsoft.com/office/drawing/2016/5/9/chartex" xmlns:cx4="http://schemas.microsoft.com/office/drawing/2016/5/10/chartex" xmlns:cx5="http://schemas.microsoft.com/office/drawing/2016/5/11/chartex" xmlns:cx6="http://schemas.microsoft.com/office/drawing/2016/5/12/chartex" xmlns:cx7="http://schemas.microsoft.com/office/drawing/2016/5/13/chartex" xmlns:cx8="http://schemas.microsoft.com/office/drawing/2016/5/14/chartex" xmlns:mc="http://schemas.openxmlformats.org/markup-compatibility/2006" xmlns:aink="http://schemas.microsoft.com/office/drawing/2016/ink" xmlns:am3d="http://schemas.microsoft.com/office/drawing/2017/model3d" xmlns:o="urn:schemas-microsoft-com:office:office" xmlns:oel="http://schemas.microsoft.com/office/2019/extlst" xmlns:r="http://schemas.openxmlformats.org/officeDocument/2006/relationships" xmlns:m="http://schemas.openxmlformats.org/officeDocument/2006/math" xmlns:v="urn:schemas-microsoft-com:vml" xmlns:wp14="http://schemas.microsoft.com/office/word/2010/wordprocessingDrawing" xmlns:wp="http://schemas.openxmlformats.org/drawingml/2006/wordprocessingDrawing" xmlns:w10="urn:schemas-microsoft-com:office:word" xmlns:w="http://schemas.openxmlformats.org/wordprocessingml/2006/main" xmlns:w14="http://schemas.microsoft.com/office/word/2010/wordml" xmlns:w15="http://schemas.microsoft.com/office/word/2012/wordml" xmlns:w16cex="http://schemas.microsoft.com/office/word/2018/wordml/cex" xmlns:w16cid="http://schemas.microsoft.com/office/word/2016/wordml/cid" xmlns:w16="http://schemas.microsoft.com/office/word/2018/wordml" xmlns:w16du="http://schemas.microsoft.com/office/word/2023/wordml/word16du" xmlns:w16sdtdh="http://schemas.microsoft.com/office/word/2020/wordml/sdtdatahash" xmlns:w16sdtfl="http://schemas.microsoft.com/office/word/2024/wordml/sdtformatlock" xmlns:w16se="http://schemas.microsoft.com/office/word/2015/wordml/symex" xmlns:wpg="http://schemas.microsoft.com/office/word/2010/wordprocessingGroup" xmlns:wpi="http://schemas.microsoft.com/office/word/2010/wordprocessingInk" xmlns:wne="http://schemas.microsoft.com/office/word/2006/wordml" xmlns:wps="http://schemas.microsoft.com/office/word/2010/wordprocessingShape" mc:Ignorable="w14 w15 w16se w16cid w16 w16cex w16sdtdh w16sdtfl w16du wp14">
+  <w:footnote w:type="separator" w:id="-1">
+    <w:p>
+      <w:pPr>
+        <w:spacing w:after="0" w:line="240" w:lineRule="auto"/>
+      </w:pPr>
+      <w:r>
+        <w:separator/>
+      </w:r>
+    </w:p>
+  </w:footnote>
+  <w:footnote w:type="continuationSeparator" w:id="0">
+    <w:p>
+      <w:pPr>
+        <w:spacing w:after="0" w:line="240" w:lineRule="auto"/>
+      </w:pPr>
+      <w:r>
+        <w:continuationSeparator/>
+      </w:r>
+    </w:p>
+  </w:footnote>
+</w:footnotes>
 </file>
 
 <file path=word/numbering.xml><?xml version="1.0" encoding="utf-8"?>
@@ -2130,7 +3329,6 @@
     <w:next w:val="Normal"/>
     <w:link w:val="Heading2Char"/>
     <w:uiPriority w:val="9"/>
-    <w:semiHidden/>
     <w:unhideWhenUsed/>
     <w:qFormat/>
     <w:rsid w:val="003D79B8"/>
@@ -2347,7 +3545,6 @@
     <w:basedOn w:val="DefaultParagraphFont"/>
     <w:link w:val="Heading2"/>
     <w:uiPriority w:val="9"/>
-    <w:semiHidden/>
     <w:rsid w:val="003D79B8"/>
     <w:rPr>
       <w:rFonts w:asciiTheme="majorHAnsi" w:eastAsiaTheme="majorEastAsia" w:hAnsiTheme="majorHAnsi" w:cstheme="majorBidi"/>
@@ -2694,6 +3891,82 @@
       <w:lang w:val="en-US"/>
       <w14:ligatures w14:val="none"/>
     </w:rPr>
+  </w:style>
+  <w:style w:type="paragraph" w:styleId="TOC2">
+    <w:name w:val="toc 2"/>
+    <w:basedOn w:val="Normal"/>
+    <w:next w:val="Normal"/>
+    <w:autoRedefine/>
+    <w:uiPriority w:val="39"/>
+    <w:unhideWhenUsed/>
+    <w:rsid w:val="00D94E95"/>
+    <w:pPr>
+      <w:spacing w:after="100"/>
+      <w:ind w:left="240"/>
+    </w:pPr>
+  </w:style>
+  <w:style w:type="paragraph" w:styleId="Header">
+    <w:name w:val="header"/>
+    <w:basedOn w:val="Normal"/>
+    <w:link w:val="HeaderChar"/>
+    <w:uiPriority w:val="99"/>
+    <w:unhideWhenUsed/>
+    <w:rsid w:val="00D94E95"/>
+    <w:pPr>
+      <w:tabs>
+        <w:tab w:val="center" w:pos="4680"/>
+        <w:tab w:val="right" w:pos="9360"/>
+      </w:tabs>
+      <w:spacing w:after="0" w:line="240" w:lineRule="auto"/>
+    </w:pPr>
+  </w:style>
+  <w:style w:type="character" w:customStyle="1" w:styleId="HeaderChar">
+    <w:name w:val="Header Char"/>
+    <w:basedOn w:val="DefaultParagraphFont"/>
+    <w:link w:val="Header"/>
+    <w:uiPriority w:val="99"/>
+    <w:rsid w:val="00D94E95"/>
+  </w:style>
+  <w:style w:type="paragraph" w:styleId="Footer">
+    <w:name w:val="footer"/>
+    <w:basedOn w:val="Normal"/>
+    <w:link w:val="FooterChar"/>
+    <w:uiPriority w:val="99"/>
+    <w:unhideWhenUsed/>
+    <w:rsid w:val="00D94E95"/>
+    <w:pPr>
+      <w:tabs>
+        <w:tab w:val="center" w:pos="4680"/>
+        <w:tab w:val="right" w:pos="9360"/>
+      </w:tabs>
+      <w:spacing w:after="0" w:line="240" w:lineRule="auto"/>
+    </w:pPr>
+  </w:style>
+  <w:style w:type="character" w:customStyle="1" w:styleId="FooterChar">
+    <w:name w:val="Footer Char"/>
+    <w:basedOn w:val="DefaultParagraphFont"/>
+    <w:link w:val="Footer"/>
+    <w:uiPriority w:val="99"/>
+    <w:rsid w:val="00D94E95"/>
+  </w:style>
+  <w:style w:type="table" w:styleId="TableGrid">
+    <w:name w:val="Table Grid"/>
+    <w:basedOn w:val="TableNormal"/>
+    <w:uiPriority w:val="39"/>
+    <w:rsid w:val="0023556F"/>
+    <w:pPr>
+      <w:spacing w:after="0" w:line="240" w:lineRule="auto"/>
+    </w:pPr>
+    <w:tblPr>
+      <w:tblBorders>
+        <w:top w:val="single" w:sz="4" w:space="0" w:color="auto"/>
+        <w:left w:val="single" w:sz="4" w:space="0" w:color="auto"/>
+        <w:bottom w:val="single" w:sz="4" w:space="0" w:color="auto"/>
+        <w:right w:val="single" w:sz="4" w:space="0" w:color="auto"/>
+        <w:insideH w:val="single" w:sz="4" w:space="0" w:color="auto"/>
+        <w:insideV w:val="single" w:sz="4" w:space="0" w:color="auto"/>
+      </w:tblBorders>
+    </w:tblPr>
   </w:style>
 </w:styles>
 </file>

</xml_diff>